<commit_message>
Primeira revisão do livro-projecto
</commit_message>
<xml_diff>
--- a/ARQUIVOS LURE_PRECI/PROJECTO CNECTA LUREFRAMULO.docx
+++ b/ARQUIVOS LURE_PRECI/PROJECTO CNECTA LUREFRAMULO.docx
@@ -151,12 +151,7 @@
         <w:pStyle w:val="Corpodetexto"/>
       </w:pPr>
       <w:r>
-        <w:t>PLANO ESTRATÉGICO PARA A TRANSFORMAÇÃO DIGITAL DO INSTITUTO TÉCNICO PRIVADO DE SAÚDE LUREFRAMULU &amp; PRECIMUEL, Lda</w:t>
-      </w:r>
-      <w:bookmarkStart w:id="0" w:name="_GoBack"/>
-      <w:bookmarkEnd w:id="0"/>
-      <w:r>
-        <w:t>.</w:t>
+        <w:t>PLANO ESTRATÉGICO PARA A TRANSFORMAÇÃO DIGITAL DO INSTITUTO TÉCNICO PRIVADO DE SAÚDE LUREFRAMULU &amp; PRECIMUEL, Lda.</w:t>
       </w:r>
     </w:p>
     <w:p>
@@ -1624,6 +1619,7 @@
     <w:p>
       <w:pPr>
         <w:spacing w:after="100" w:afterAutospacing="1" w:line="360" w:lineRule="auto"/>
+        <w:ind w:left="2124"/>
         <w:jc w:val="both"/>
         <w:rPr>
           <w:rFonts w:ascii="Times New Roman" w:eastAsia="Times New Roman" w:hAnsi="Times New Roman" w:cs="Times New Roman"/>
@@ -1647,6 +1643,7 @@
     <w:p>
       <w:pPr>
         <w:spacing w:after="100" w:afterAutospacing="1" w:line="360" w:lineRule="auto"/>
+        <w:ind w:left="2124"/>
         <w:jc w:val="both"/>
         <w:rPr>
           <w:rFonts w:ascii="Times New Roman" w:eastAsia="Times New Roman" w:hAnsi="Times New Roman" w:cs="Times New Roman"/>
@@ -1862,27 +1859,6 @@
     </w:p>
     <w:p>
       <w:pPr>
-        <w:pStyle w:val="Ttulo2"/>
-        <w:spacing w:before="0" w:line="360" w:lineRule="auto"/>
-        <w:ind w:firstLine="567"/>
-        <w:jc w:val="both"/>
-        <w:rPr>
-          <w:rFonts w:ascii="Times New Roman" w:hAnsi="Times New Roman" w:cs="Times New Roman"/>
-          <w:sz w:val="24"/>
-          <w:szCs w:val="24"/>
-        </w:rPr>
-      </w:pPr>
-      <w:r>
-        <w:rPr>
-          <w:rFonts w:ascii="Times New Roman" w:hAnsi="Times New Roman" w:cs="Times New Roman"/>
-          <w:sz w:val="24"/>
-          <w:szCs w:val="24"/>
-        </w:rPr>
-        <w:t>As instituições de ensino e a transformação da comunicação</w:t>
-      </w:r>
-    </w:p>
-    <w:p>
-      <w:pPr>
         <w:pStyle w:val="NormalWeb"/>
         <w:spacing w:before="0" w:beforeAutospacing="0" w:line="360" w:lineRule="auto"/>
         <w:ind w:firstLine="567"/>
@@ -1927,27 +1903,6 @@
     </w:p>
     <w:p>
       <w:pPr>
-        <w:pStyle w:val="Ttulo2"/>
-        <w:spacing w:before="0" w:line="360" w:lineRule="auto"/>
-        <w:ind w:firstLine="567"/>
-        <w:jc w:val="both"/>
-        <w:rPr>
-          <w:rFonts w:ascii="Times New Roman" w:hAnsi="Times New Roman" w:cs="Times New Roman"/>
-          <w:sz w:val="24"/>
-          <w:szCs w:val="24"/>
-        </w:rPr>
-      </w:pPr>
-      <w:r>
-        <w:rPr>
-          <w:rFonts w:ascii="Times New Roman" w:hAnsi="Times New Roman" w:cs="Times New Roman"/>
-          <w:sz w:val="24"/>
-          <w:szCs w:val="24"/>
-        </w:rPr>
-        <w:t>A comunicação como fator estratégico</w:t>
-      </w:r>
-    </w:p>
-    <w:p>
-      <w:pPr>
         <w:pStyle w:val="NormalWeb"/>
         <w:spacing w:before="0" w:beforeAutospacing="0" w:line="360" w:lineRule="auto"/>
         <w:ind w:firstLine="567"/>
@@ -1965,8 +1920,11 @@
         <w:jc w:val="both"/>
       </w:pPr>
       <w:r>
+        <w:t xml:space="preserve">Uma comunicação bem estruturada contribui para aproximar estudantes, encarregados de educação, docentes, colaboradores e parceiros, criando uma relação </w:t>
+      </w:r>
+      <w:r>
         <w:lastRenderedPageBreak/>
-        <w:t>Uma comunicação bem estruturada contribui para aproximar estudantes, encarregados de educação, docentes, colaboradores e parceiros, criando uma relação baseada na transparência, na credibilidade e na facilidade de acesso à informação. Quando esta comunicação é apoiada por uma plataforma digital organizada, torna-se possível oferecer uma experiência mais consistente, reduzindo dificuldades no acesso às informações e fortalecendo a imagem institucional.</w:t>
+        <w:t>baseada na transparência, na credibilidade e na facilidade de acesso à informação. Quando esta comunicação é apoiada por uma plataforma digital organizada, torna-se possível oferecer uma experiência mais consistente, reduzindo dificuldades no acesso às informações e fortalecendo a imagem institucional.</w:t>
       </w:r>
     </w:p>
     <w:p>
@@ -1982,27 +1940,6 @@
     </w:p>
     <w:p>
       <w:pPr>
-        <w:pStyle w:val="Ttulo2"/>
-        <w:spacing w:before="0" w:line="360" w:lineRule="auto"/>
-        <w:ind w:firstLine="567"/>
-        <w:jc w:val="both"/>
-        <w:rPr>
-          <w:rFonts w:ascii="Times New Roman" w:hAnsi="Times New Roman" w:cs="Times New Roman"/>
-          <w:sz w:val="24"/>
-          <w:szCs w:val="24"/>
-        </w:rPr>
-      </w:pPr>
-      <w:r>
-        <w:rPr>
-          <w:rFonts w:ascii="Times New Roman" w:hAnsi="Times New Roman" w:cs="Times New Roman"/>
-          <w:sz w:val="24"/>
-          <w:szCs w:val="24"/>
-        </w:rPr>
-        <w:t>Oportunidade para o Instituto Técnico Privado de Saúde Lureframulu &amp; Precimuel, Lda.</w:t>
-      </w:r>
-    </w:p>
-    <w:p>
-      <w:pPr>
         <w:pStyle w:val="NormalWeb"/>
         <w:spacing w:before="0" w:beforeAutospacing="0" w:line="360" w:lineRule="auto"/>
         <w:ind w:firstLine="567"/>
@@ -2076,67 +2013,54 @@
     </w:p>
     <w:p>
       <w:pPr>
-        <w:spacing w:line="360" w:lineRule="auto"/>
-        <w:ind w:firstLine="567"/>
-        <w:jc w:val="both"/>
-        <w:rPr>
-          <w:rFonts w:ascii="Times New Roman" w:hAnsi="Times New Roman" w:cs="Times New Roman"/>
-          <w:sz w:val="24"/>
-          <w:szCs w:val="24"/>
-        </w:rPr>
-      </w:pPr>
-      <w:r>
-        <w:rPr>
-          <w:rFonts w:ascii="Times New Roman" w:hAnsi="Times New Roman" w:cs="Times New Roman"/>
+        <w:pStyle w:val="Ttulo1"/>
+        <w:spacing w:line="360" w:lineRule="auto"/>
+        <w:jc w:val="both"/>
+        <w:rPr>
+          <w:sz w:val="24"/>
+          <w:szCs w:val="24"/>
+        </w:rPr>
+      </w:pPr>
+      <w:r>
+        <w:rPr>
           <w:sz w:val="24"/>
           <w:szCs w:val="24"/>
         </w:rPr>
         <w:lastRenderedPageBreak/>
+        <w:t xml:space="preserve">3. </w:t>
+      </w:r>
+      <w:r>
+        <w:rPr>
+          <w:sz w:val="24"/>
+          <w:szCs w:val="24"/>
+        </w:rPr>
+        <w:t>DIAGNÓSTICO DA SITUAÇÃO ATUAL</w:t>
+      </w:r>
+    </w:p>
+    <w:p>
+      <w:pPr>
+        <w:spacing w:line="360" w:lineRule="auto"/>
+        <w:ind w:firstLine="567"/>
+        <w:jc w:val="both"/>
+        <w:rPr>
+          <w:rFonts w:ascii="Times New Roman" w:hAnsi="Times New Roman" w:cs="Times New Roman"/>
+          <w:i/>
+          <w:sz w:val="24"/>
+          <w:szCs w:val="24"/>
+        </w:rPr>
+      </w:pPr>
+      <w:r>
+        <w:rPr>
+          <w:rFonts w:ascii="Times New Roman" w:hAnsi="Times New Roman" w:cs="Times New Roman"/>
+          <w:i/>
+          <w:sz w:val="24"/>
+          <w:szCs w:val="24"/>
+        </w:rPr>
         <w:t>"Toda oportunidade de crescimento começa por compreender a realidade e reconhecer o potencial que já existe."</w:t>
       </w:r>
     </w:p>
     <w:p>
       <w:pPr>
-        <w:pStyle w:val="Ttulo1"/>
-        <w:spacing w:line="360" w:lineRule="auto"/>
-        <w:ind w:firstLine="567"/>
-        <w:jc w:val="both"/>
-        <w:rPr>
-          <w:sz w:val="24"/>
-          <w:szCs w:val="24"/>
-        </w:rPr>
-      </w:pPr>
-      <w:r>
-        <w:rPr>
-          <w:sz w:val="24"/>
-          <w:szCs w:val="24"/>
-        </w:rPr>
-        <w:t>4. Diagnóstico da Situação Atual</w:t>
-      </w:r>
-    </w:p>
-    <w:p>
-      <w:pPr>
-        <w:pStyle w:val="Ttulo2"/>
-        <w:spacing w:line="360" w:lineRule="auto"/>
-        <w:ind w:firstLine="567"/>
-        <w:jc w:val="both"/>
-        <w:rPr>
-          <w:rFonts w:ascii="Times New Roman" w:hAnsi="Times New Roman" w:cs="Times New Roman"/>
-          <w:sz w:val="24"/>
-          <w:szCs w:val="24"/>
-        </w:rPr>
-      </w:pPr>
-      <w:r>
-        <w:rPr>
-          <w:rFonts w:ascii="Times New Roman" w:hAnsi="Times New Roman" w:cs="Times New Roman"/>
-          <w:sz w:val="24"/>
-          <w:szCs w:val="24"/>
-        </w:rPr>
-        <w:t>Uma instituição em crescimento e em constante evolução</w:t>
-      </w:r>
-    </w:p>
-    <w:p>
-      <w:pPr>
         <w:pStyle w:val="NormalWeb"/>
         <w:spacing w:line="360" w:lineRule="auto"/>
         <w:ind w:firstLine="567"/>
@@ -2170,27 +2094,6 @@
     </w:p>
     <w:p>
       <w:pPr>
-        <w:pStyle w:val="Ttulo2"/>
-        <w:spacing w:line="360" w:lineRule="auto"/>
-        <w:ind w:firstLine="567"/>
-        <w:jc w:val="both"/>
-        <w:rPr>
-          <w:rFonts w:ascii="Times New Roman" w:hAnsi="Times New Roman" w:cs="Times New Roman"/>
-          <w:sz w:val="24"/>
-          <w:szCs w:val="24"/>
-        </w:rPr>
-      </w:pPr>
-      <w:r>
-        <w:rPr>
-          <w:rFonts w:ascii="Times New Roman" w:hAnsi="Times New Roman" w:cs="Times New Roman"/>
-          <w:sz w:val="24"/>
-          <w:szCs w:val="24"/>
-        </w:rPr>
-        <w:t>Uma nova realidade na comunicação institucional</w:t>
-      </w:r>
-    </w:p>
-    <w:p>
-      <w:pPr>
         <w:pStyle w:val="NormalWeb"/>
         <w:spacing w:line="360" w:lineRule="auto"/>
         <w:ind w:firstLine="567"/>
@@ -2220,28 +2123,6 @@
       </w:pPr>
       <w:r>
         <w:t>Neste novo cenário, a comunicação institucional deixa de ocorrer apenas durante campanhas específicas e passa a ser permanente, estando disponível sempre que alguém procura informações sobre a instituição.</w:t>
-      </w:r>
-    </w:p>
-    <w:p>
-      <w:pPr>
-        <w:pStyle w:val="Ttulo2"/>
-        <w:spacing w:line="360" w:lineRule="auto"/>
-        <w:ind w:firstLine="567"/>
-        <w:jc w:val="both"/>
-        <w:rPr>
-          <w:rFonts w:ascii="Times New Roman" w:hAnsi="Times New Roman" w:cs="Times New Roman"/>
-          <w:sz w:val="24"/>
-          <w:szCs w:val="24"/>
-        </w:rPr>
-      </w:pPr>
-      <w:r>
-        <w:rPr>
-          <w:rFonts w:ascii="Times New Roman" w:hAnsi="Times New Roman" w:cs="Times New Roman"/>
-          <w:sz w:val="24"/>
-          <w:szCs w:val="24"/>
-        </w:rPr>
-        <w:lastRenderedPageBreak/>
-        <w:t>Oportunidades identificadas</w:t>
       </w:r>
     </w:p>
     <w:p>
@@ -2282,6 +2163,7 @@
         <w:jc w:val="both"/>
       </w:pPr>
       <w:r>
+        <w:lastRenderedPageBreak/>
         <w:t>Reunir informações atualmente dispersas em diferentes meios de comunicação, facilitando o acesso por parte dos estudantes, encarregados de educação e parceiros;</w:t>
       </w:r>
     </w:p>
@@ -2344,22 +2226,30 @@
     <w:p>
       <w:pPr>
         <w:pStyle w:val="Ttulo2"/>
-        <w:spacing w:line="360" w:lineRule="auto"/>
-        <w:ind w:firstLine="567"/>
-        <w:jc w:val="both"/>
-        <w:rPr>
-          <w:rFonts w:ascii="Times New Roman" w:hAnsi="Times New Roman" w:cs="Times New Roman"/>
-          <w:sz w:val="24"/>
-          <w:szCs w:val="24"/>
-        </w:rPr>
-      </w:pPr>
-      <w:r>
-        <w:rPr>
-          <w:rFonts w:ascii="Times New Roman" w:hAnsi="Times New Roman" w:cs="Times New Roman"/>
-          <w:sz w:val="24"/>
-          <w:szCs w:val="24"/>
-        </w:rPr>
-        <w:t>Um momento estratégico para evoluir</w:t>
+        <w:numPr>
+          <w:ilvl w:val="0"/>
+          <w:numId w:val="8"/>
+        </w:numPr>
+        <w:spacing w:line="360" w:lineRule="auto"/>
+        <w:ind w:left="426"/>
+        <w:jc w:val="both"/>
+        <w:rPr>
+          <w:rFonts w:ascii="Times New Roman" w:hAnsi="Times New Roman" w:cs="Times New Roman"/>
+          <w:b/>
+          <w:color w:val="auto"/>
+          <w:sz w:val="24"/>
+          <w:szCs w:val="24"/>
+        </w:rPr>
+      </w:pPr>
+      <w:r>
+        <w:rPr>
+          <w:rFonts w:ascii="Times New Roman" w:hAnsi="Times New Roman" w:cs="Times New Roman"/>
+          <w:b/>
+          <w:color w:val="auto"/>
+          <w:sz w:val="24"/>
+          <w:szCs w:val="24"/>
+        </w:rPr>
+        <w:t>UM MOMENTO ESTRATÉGICO PARA EVOLUIR</w:t>
       </w:r>
     </w:p>
     <w:p>
@@ -2396,6 +2286,25 @@
       </w:r>
       <w:r>
         <w:br w:type="page"/>
+      </w:r>
+    </w:p>
+    <w:p>
+      <w:pPr>
+        <w:pStyle w:val="Ttulo1"/>
+        <w:spacing w:line="360" w:lineRule="auto"/>
+        <w:jc w:val="both"/>
+        <w:rPr>
+          <w:sz w:val="24"/>
+          <w:szCs w:val="24"/>
+        </w:rPr>
+      </w:pPr>
+      <w:r>
+        <w:rPr>
+          <w:sz w:val="24"/>
+          <w:szCs w:val="24"/>
+        </w:rPr>
+        <w:lastRenderedPageBreak/>
+        <w:t>5. CONSEQUÊNCIAS DA SITUAÇÃO ATUAL</w:t>
       </w:r>
     </w:p>
     <w:p>
@@ -2419,52 +2328,11 @@
           <w:szCs w:val="24"/>
           <w:lang w:eastAsia="pt-BR"/>
         </w:rPr>
-        <w:lastRenderedPageBreak/>
         <w:t>"As maiores oportunidades nem sempre são perdidas por falta de capacidade, mas por falta do momento certo para as concretizar."</w:t>
       </w:r>
     </w:p>
     <w:p>
       <w:pPr>
-        <w:pStyle w:val="Ttulo1"/>
-        <w:spacing w:line="360" w:lineRule="auto"/>
-        <w:ind w:firstLine="567"/>
-        <w:jc w:val="both"/>
-        <w:rPr>
-          <w:sz w:val="24"/>
-          <w:szCs w:val="24"/>
-        </w:rPr>
-      </w:pPr>
-      <w:r>
-        <w:rPr>
-          <w:sz w:val="24"/>
-          <w:szCs w:val="24"/>
-        </w:rPr>
-        <w:t>5. Consequências da Situação Atual</w:t>
-      </w:r>
-    </w:p>
-    <w:p>
-      <w:pPr>
-        <w:pStyle w:val="Ttulo2"/>
-        <w:spacing w:line="360" w:lineRule="auto"/>
-        <w:ind w:firstLine="567"/>
-        <w:jc w:val="both"/>
-        <w:rPr>
-          <w:rFonts w:ascii="Times New Roman" w:hAnsi="Times New Roman" w:cs="Times New Roman"/>
-          <w:sz w:val="24"/>
-          <w:szCs w:val="24"/>
-        </w:rPr>
-      </w:pPr>
-      <w:r>
-        <w:rPr>
-          <w:rFonts w:ascii="Times New Roman" w:hAnsi="Times New Roman" w:cs="Times New Roman"/>
-          <w:sz w:val="24"/>
-          <w:szCs w:val="24"/>
-        </w:rPr>
-        <w:t>O impacto da evolução da comunicação</w:t>
-      </w:r>
-    </w:p>
-    <w:p>
-      <w:pPr>
         <w:pStyle w:val="NormalWeb"/>
         <w:spacing w:line="360" w:lineRule="auto"/>
         <w:ind w:firstLine="567"/>
@@ -2487,27 +2355,6 @@
     </w:p>
     <w:p>
       <w:pPr>
-        <w:pStyle w:val="Ttulo2"/>
-        <w:spacing w:line="360" w:lineRule="auto"/>
-        <w:ind w:firstLine="567"/>
-        <w:jc w:val="both"/>
-        <w:rPr>
-          <w:rFonts w:ascii="Times New Roman" w:hAnsi="Times New Roman" w:cs="Times New Roman"/>
-          <w:sz w:val="24"/>
-          <w:szCs w:val="24"/>
-        </w:rPr>
-      </w:pPr>
-      <w:r>
-        <w:rPr>
-          <w:rFonts w:ascii="Times New Roman" w:hAnsi="Times New Roman" w:cs="Times New Roman"/>
-          <w:sz w:val="24"/>
-          <w:szCs w:val="24"/>
-        </w:rPr>
-        <w:t>O custo de adiar uma oportunidade</w:t>
-      </w:r>
-    </w:p>
-    <w:p>
-      <w:pPr>
         <w:pStyle w:val="NormalWeb"/>
         <w:spacing w:line="360" w:lineRule="auto"/>
         <w:ind w:firstLine="567"/>
@@ -2537,28 +2384,6 @@
       </w:pPr>
       <w:r>
         <w:t>Quando essa experiência digital ainda não está disponível, a comunicação tende a depender exclusivamente dos canais tradicionais e do contacto presencial, limitando a continuidade do relacionamento iniciado pelas ações promocionais.</w:t>
-      </w:r>
-    </w:p>
-    <w:p>
-      <w:pPr>
-        <w:pStyle w:val="Ttulo2"/>
-        <w:spacing w:line="360" w:lineRule="auto"/>
-        <w:ind w:firstLine="567"/>
-        <w:jc w:val="both"/>
-        <w:rPr>
-          <w:rFonts w:ascii="Times New Roman" w:hAnsi="Times New Roman" w:cs="Times New Roman"/>
-          <w:sz w:val="24"/>
-          <w:szCs w:val="24"/>
-        </w:rPr>
-      </w:pPr>
-      <w:r>
-        <w:rPr>
-          <w:rFonts w:ascii="Times New Roman" w:hAnsi="Times New Roman" w:cs="Times New Roman"/>
-          <w:sz w:val="24"/>
-          <w:szCs w:val="24"/>
-        </w:rPr>
-        <w:lastRenderedPageBreak/>
-        <w:t>Oportunidades que podem ser ampliadas</w:t>
       </w:r>
     </w:p>
     <w:p>
@@ -2629,6 +2454,7 @@
         <w:jc w:val="both"/>
       </w:pPr>
       <w:r>
+        <w:lastRenderedPageBreak/>
         <w:t>facilitar o contacto com estudantes e encarregados de educação;</w:t>
       </w:r>
     </w:p>
@@ -2675,214 +2501,163 @@
     </w:p>
     <w:p>
       <w:pPr>
+        <w:pStyle w:val="NormalWeb"/>
+        <w:spacing w:line="360" w:lineRule="auto"/>
+        <w:ind w:firstLine="567"/>
+        <w:jc w:val="both"/>
+      </w:pPr>
+      <w:r>
+        <w:t>Neste contexto, adiar a implementação de uma presença digital estruturada não significa permanecer estagnado, mas pode representar a perda de oportunidades de crescimento, de modernização e de aproximação com públicos que, diariamente, utilizam os meios digitais como principal forma de acesso à informação.</w:t>
+      </w:r>
+    </w:p>
+    <w:p>
+      <w:pPr>
+        <w:pStyle w:val="NormalWeb"/>
+        <w:spacing w:line="360" w:lineRule="auto"/>
+        <w:ind w:firstLine="567"/>
+        <w:jc w:val="both"/>
+      </w:pPr>
+      <w:r>
+        <w:t xml:space="preserve">O </w:t>
+      </w:r>
+      <w:r>
+        <w:rPr>
+          <w:rStyle w:val="Forte"/>
+        </w:rPr>
+        <w:t>Projeto Conecta Lureframulu &amp; Precimuel</w:t>
+      </w:r>
+      <w:r>
+        <w:t xml:space="preserve"> surge precisamente para transformar essa oportunidade em realidade, permitindo que o Instituto continue a evoluir sem abdicar da sua identidade, da sua missão e dos valores que o distinguem.</w:t>
+      </w:r>
+    </w:p>
+    <w:p>
+      <w:pPr>
+        <w:pStyle w:val="NormalWeb"/>
+        <w:spacing w:line="360" w:lineRule="auto"/>
+        <w:ind w:firstLine="567"/>
+        <w:jc w:val="both"/>
+      </w:pPr>
+      <w:r>
+        <w:t>Mais do que propor uma solução tecnológica, esta iniciativa pretende apresentar uma visão de crescimento sustentável, alinhada com a missão educativa do Instituto e preparada para responder às novas formas de comunicação e interação da sociedade contemporânea.</w:t>
+      </w:r>
+    </w:p>
+    <w:p>
+      <w:pPr>
+        <w:rPr>
+          <w:rFonts w:ascii="Times New Roman" w:eastAsia="Times New Roman" w:hAnsi="Times New Roman" w:cs="Times New Roman"/>
+          <w:sz w:val="24"/>
+          <w:szCs w:val="24"/>
+          <w:lang w:eastAsia="pt-BR"/>
+        </w:rPr>
+      </w:pPr>
+      <w:r>
+        <w:rPr>
+          <w:rFonts w:ascii="Times New Roman" w:eastAsia="Times New Roman" w:hAnsi="Times New Roman" w:cs="Times New Roman"/>
+          <w:sz w:val="24"/>
+          <w:szCs w:val="24"/>
+          <w:lang w:eastAsia="pt-BR"/>
+        </w:rPr>
+        <w:br w:type="page"/>
+      </w:r>
+    </w:p>
+    <w:p>
+      <w:pPr>
+        <w:pStyle w:val="Ttulo1"/>
+        <w:spacing w:line="360" w:lineRule="auto"/>
+        <w:jc w:val="both"/>
+        <w:rPr>
+          <w:sz w:val="24"/>
+          <w:szCs w:val="24"/>
+        </w:rPr>
+      </w:pPr>
+      <w:r>
+        <w:rPr>
+          <w:sz w:val="24"/>
+          <w:szCs w:val="24"/>
+        </w:rPr>
+        <w:lastRenderedPageBreak/>
+        <w:t>6. OBJETIVOS DA PROPOSTA</w:t>
+      </w:r>
+    </w:p>
+    <w:p>
+      <w:pPr>
+        <w:pStyle w:val="NormalWeb"/>
+        <w:spacing w:line="360" w:lineRule="auto"/>
+        <w:jc w:val="both"/>
+        <w:rPr>
+          <w:i/>
+        </w:rPr>
+      </w:pPr>
+      <w:r>
+        <w:rPr>
+          <w:i/>
+        </w:rPr>
+        <w:t>"Toda grande transformação começa quando existe um propósito claro e uma visão bem definida."</w:t>
+      </w:r>
+    </w:p>
+    <w:p>
+      <w:pPr>
         <w:pStyle w:val="Ttulo2"/>
-        <w:spacing w:line="360" w:lineRule="auto"/>
-        <w:ind w:firstLine="567"/>
-        <w:jc w:val="both"/>
-        <w:rPr>
-          <w:rFonts w:ascii="Times New Roman" w:hAnsi="Times New Roman" w:cs="Times New Roman"/>
-          <w:sz w:val="24"/>
-          <w:szCs w:val="24"/>
-        </w:rPr>
-      </w:pPr>
-      <w:r>
-        <w:rPr>
-          <w:rFonts w:ascii="Times New Roman" w:hAnsi="Times New Roman" w:cs="Times New Roman"/>
-          <w:sz w:val="24"/>
-          <w:szCs w:val="24"/>
-        </w:rPr>
-        <w:t>Um investimento orientado para o futuro</w:t>
-      </w:r>
-    </w:p>
-    <w:p>
-      <w:pPr>
-        <w:pStyle w:val="NormalWeb"/>
-        <w:spacing w:line="360" w:lineRule="auto"/>
-        <w:ind w:firstLine="567"/>
-        <w:jc w:val="both"/>
-      </w:pPr>
-      <w:r>
-        <w:t>A evolução digital das instituições de ensino tem demonstrado que a comunicação institucional deixou de ser um elemento complementar para assumir um papel estratégico no fortalecimento da imagem, da confiança e da proximidade com a comunidade.</w:t>
-      </w:r>
-    </w:p>
-    <w:p>
-      <w:pPr>
-        <w:pStyle w:val="NormalWeb"/>
-        <w:spacing w:line="360" w:lineRule="auto"/>
-        <w:ind w:firstLine="567"/>
-        <w:jc w:val="both"/>
-      </w:pPr>
-      <w:r>
-        <w:t>Neste contexto, adiar a implementação de uma presença digital estruturada não significa permanecer estagnado, mas pode representar a perda de oportunidades de crescimento, de modernização e de aproximação com públicos que, diariamente, utilizam os meios digitais como principal forma de acesso à informação.</w:t>
-      </w:r>
-    </w:p>
-    <w:p>
-      <w:pPr>
-        <w:pStyle w:val="NormalWeb"/>
-        <w:spacing w:line="360" w:lineRule="auto"/>
-        <w:ind w:firstLine="567"/>
-        <w:jc w:val="both"/>
-      </w:pPr>
-      <w:r>
-        <w:t xml:space="preserve">O </w:t>
-      </w:r>
-      <w:r>
-        <w:rPr>
-          <w:rStyle w:val="Forte"/>
-        </w:rPr>
-        <w:t>Projeto Conecta Lureframulu &amp; Precimuel</w:t>
-      </w:r>
-      <w:r>
-        <w:t xml:space="preserve"> surge precisamente para transformar essa oportunidade em realidade, permitindo que o Instituto continue a evoluir sem abdicar da sua identidade, da sua missão e dos valores que o distinguem.</w:t>
-      </w:r>
-    </w:p>
-    <w:p>
-      <w:pPr>
-        <w:spacing w:line="360" w:lineRule="auto"/>
-        <w:jc w:val="both"/>
-        <w:rPr>
-          <w:rFonts w:ascii="Times New Roman" w:eastAsia="Times New Roman" w:hAnsi="Times New Roman" w:cs="Times New Roman"/>
-          <w:sz w:val="24"/>
-          <w:szCs w:val="24"/>
-          <w:lang w:eastAsia="pt-BR"/>
-        </w:rPr>
-      </w:pPr>
-      <w:r>
-        <w:rPr>
-          <w:rFonts w:ascii="Times New Roman" w:hAnsi="Times New Roman" w:cs="Times New Roman"/>
-          <w:sz w:val="24"/>
-          <w:szCs w:val="24"/>
-        </w:rPr>
-        <w:br w:type="page"/>
-      </w:r>
-    </w:p>
-    <w:p>
-      <w:pPr>
-        <w:pStyle w:val="Ttulo1"/>
-        <w:spacing w:line="360" w:lineRule="auto"/>
-        <w:jc w:val="both"/>
-        <w:rPr>
-          <w:sz w:val="24"/>
-          <w:szCs w:val="24"/>
-        </w:rPr>
-      </w:pPr>
-      <w:r>
-        <w:rPr>
-          <w:sz w:val="24"/>
-          <w:szCs w:val="24"/>
-        </w:rPr>
-        <w:lastRenderedPageBreak/>
-        <w:t>6. Objetivos da Proposta</w:t>
+        <w:numPr>
+          <w:ilvl w:val="0"/>
+          <w:numId w:val="9"/>
+        </w:numPr>
+        <w:spacing w:line="360" w:lineRule="auto"/>
+        <w:ind w:left="709"/>
+        <w:jc w:val="both"/>
+        <w:rPr>
+          <w:rFonts w:ascii="Times New Roman" w:hAnsi="Times New Roman" w:cs="Times New Roman"/>
+          <w:b/>
+          <w:color w:val="auto"/>
+          <w:sz w:val="24"/>
+          <w:szCs w:val="24"/>
+        </w:rPr>
+      </w:pPr>
+      <w:r>
+        <w:rPr>
+          <w:rFonts w:ascii="Times New Roman" w:hAnsi="Times New Roman" w:cs="Times New Roman"/>
+          <w:b/>
+          <w:color w:val="auto"/>
+          <w:sz w:val="24"/>
+          <w:szCs w:val="24"/>
+        </w:rPr>
+        <w:t>Objetivo Geral</w:t>
+      </w:r>
+    </w:p>
+    <w:p>
+      <w:pPr>
+        <w:pStyle w:val="NormalWeb"/>
+        <w:spacing w:line="360" w:lineRule="auto"/>
+        <w:ind w:firstLine="567"/>
+        <w:jc w:val="both"/>
+      </w:pPr>
+      <w:r>
+        <w:t>Desenvolver uma Plataforma Institucional Digital moderna, intuitiva e escalável, capaz de fortalecer a comunicação institucional, valorizar a identidade do Instituto, ampliar o alcance das suas ações de divulgação e apoiar o processo de modernização dos seus serviços de informação e relacionamento com a comunidade.</w:t>
       </w:r>
     </w:p>
     <w:p>
       <w:pPr>
         <w:pStyle w:val="Ttulo2"/>
-        <w:spacing w:line="360" w:lineRule="auto"/>
-        <w:jc w:val="both"/>
-        <w:rPr>
-          <w:rFonts w:ascii="Times New Roman" w:hAnsi="Times New Roman" w:cs="Times New Roman"/>
-          <w:sz w:val="24"/>
-          <w:szCs w:val="24"/>
-        </w:rPr>
-      </w:pPr>
-      <w:r>
-        <w:rPr>
-          <w:rFonts w:ascii="Times New Roman" w:hAnsi="Times New Roman" w:cs="Times New Roman"/>
-          <w:sz w:val="24"/>
-          <w:szCs w:val="24"/>
-        </w:rPr>
-        <w:t>O propósito da proposta</w:t>
-      </w:r>
-    </w:p>
-    <w:p>
-      <w:pPr>
-        <w:pStyle w:val="NormalWeb"/>
-        <w:spacing w:line="360" w:lineRule="auto"/>
-        <w:jc w:val="both"/>
-      </w:pPr>
-      <w:r>
-        <w:t>"Toda grande transformação começa quando existe um propósito claro e uma visão bem definida."</w:t>
-      </w:r>
-    </w:p>
-    <w:p>
-      <w:pPr>
-        <w:pStyle w:val="NormalWeb"/>
-        <w:spacing w:line="360" w:lineRule="auto"/>
-        <w:ind w:firstLine="567"/>
-        <w:jc w:val="both"/>
-      </w:pPr>
-      <w:r>
-        <w:t xml:space="preserve">O </w:t>
-      </w:r>
-      <w:r>
-        <w:rPr>
-          <w:rStyle w:val="Forte"/>
-        </w:rPr>
-        <w:t>Projeto Conecta Lureframulu &amp; Precimuel</w:t>
-      </w:r>
-      <w:r>
-        <w:t xml:space="preserve"> foi concebido com o propósito de contribuir para o fortalecimento da presença institucional do Instituto Técnico Privado de Saúde Lureframulu &amp; Precimuel, Lda., através do desenvolvimento de uma Plataforma Institucional Digital que complemente as estratégias de comunicação já existentes, aproxime a instituição da comunidade e crie bases sólidas para a evolução gradual dos seus serviços digitais.</w:t>
-      </w:r>
-    </w:p>
-    <w:p>
-      <w:pPr>
-        <w:pStyle w:val="NormalWeb"/>
-        <w:spacing w:line="360" w:lineRule="auto"/>
-        <w:ind w:firstLine="567"/>
-        <w:jc w:val="both"/>
-      </w:pPr>
-      <w:r>
-        <w:t>Mais do que propor uma solução tecnológica, esta iniciativa pretende apresentar uma visão de crescimento sustentável, alinhada com a missão educativa do Instituto e preparada para responder às novas formas de comunicação e interação da sociedade contemporânea.</w:t>
-      </w:r>
-    </w:p>
-    <w:p>
-      <w:pPr>
-        <w:pStyle w:val="Ttulo2"/>
-        <w:spacing w:line="360" w:lineRule="auto"/>
-        <w:ind w:firstLine="567"/>
-        <w:jc w:val="both"/>
-        <w:rPr>
-          <w:rFonts w:ascii="Times New Roman" w:hAnsi="Times New Roman" w:cs="Times New Roman"/>
-          <w:sz w:val="24"/>
-          <w:szCs w:val="24"/>
-        </w:rPr>
-      </w:pPr>
-      <w:r>
-        <w:rPr>
-          <w:rFonts w:ascii="Times New Roman" w:hAnsi="Times New Roman" w:cs="Times New Roman"/>
-          <w:sz w:val="24"/>
-          <w:szCs w:val="24"/>
-        </w:rPr>
-        <w:t>Objetivo Geral</w:t>
-      </w:r>
-    </w:p>
-    <w:p>
-      <w:pPr>
-        <w:pStyle w:val="NormalWeb"/>
-        <w:spacing w:line="360" w:lineRule="auto"/>
-        <w:ind w:firstLine="567"/>
-        <w:jc w:val="both"/>
-      </w:pPr>
-      <w:r>
-        <w:t>Desenvolver uma Plataforma Institucional Digital moderna, intuitiva e escalável, capaz de fortalecer a comunicação institucional, valorizar a identidade do Instituto, ampliar o alcance das suas ações de divulgação e apoiar o processo de modernização dos seus serviços de informação e relacionamento com a comunidade.</w:t>
-      </w:r>
-    </w:p>
-    <w:p>
-      <w:pPr>
-        <w:pStyle w:val="Ttulo2"/>
-        <w:spacing w:line="360" w:lineRule="auto"/>
-        <w:ind w:firstLine="567"/>
-        <w:jc w:val="both"/>
-        <w:rPr>
-          <w:rFonts w:ascii="Times New Roman" w:hAnsi="Times New Roman" w:cs="Times New Roman"/>
-          <w:sz w:val="24"/>
-          <w:szCs w:val="24"/>
-        </w:rPr>
-      </w:pPr>
-      <w:r>
-        <w:rPr>
-          <w:rFonts w:ascii="Times New Roman" w:hAnsi="Times New Roman" w:cs="Times New Roman"/>
+        <w:numPr>
+          <w:ilvl w:val="0"/>
+          <w:numId w:val="9"/>
+        </w:numPr>
+        <w:spacing w:line="360" w:lineRule="auto"/>
+        <w:ind w:left="709"/>
+        <w:jc w:val="both"/>
+        <w:rPr>
+          <w:rFonts w:ascii="Times New Roman" w:hAnsi="Times New Roman" w:cs="Times New Roman"/>
+          <w:b/>
+          <w:color w:val="auto"/>
+          <w:sz w:val="24"/>
+          <w:szCs w:val="24"/>
+        </w:rPr>
+      </w:pPr>
+      <w:r>
+        <w:rPr>
+          <w:rFonts w:ascii="Times New Roman" w:hAnsi="Times New Roman" w:cs="Times New Roman"/>
+          <w:b/>
+          <w:color w:val="auto"/>
           <w:sz w:val="24"/>
           <w:szCs w:val="24"/>
         </w:rPr>
@@ -2957,7 +2732,6 @@
         <w:jc w:val="both"/>
       </w:pPr>
       <w:r>
-        <w:lastRenderedPageBreak/>
         <w:t>complementar as campanhas de divulgação já realizadas, prolongando o seu impacto no ambiente digital;</w:t>
       </w:r>
     </w:p>
@@ -3049,6 +2823,7 @@
         <w:rPr>
           <w:rStyle w:val="Forte"/>
         </w:rPr>
+        <w:lastRenderedPageBreak/>
         <w:t>Valorizar a identidade institucional</w:t>
       </w:r>
       <w:r>
@@ -3157,58 +2932,42 @@
     </w:p>
     <w:p>
       <w:pPr>
-        <w:pStyle w:val="NormalWeb"/>
-        <w:spacing w:line="360" w:lineRule="auto"/>
-        <w:ind w:firstLine="567"/>
-        <w:jc w:val="both"/>
-      </w:pPr>
-      <w:r>
+        <w:pStyle w:val="Ttulo1"/>
+        <w:spacing w:before="0" w:beforeAutospacing="0" w:line="360" w:lineRule="auto"/>
+        <w:jc w:val="both"/>
+        <w:rPr>
+          <w:sz w:val="24"/>
+          <w:szCs w:val="24"/>
+        </w:rPr>
+      </w:pPr>
+      <w:r>
+        <w:rPr>
+          <w:sz w:val="24"/>
+          <w:szCs w:val="24"/>
+        </w:rPr>
         <w:lastRenderedPageBreak/>
+        <w:t>7. A SOLUÇÃO PROPOSTA</w:t>
+      </w:r>
+    </w:p>
+    <w:p>
+      <w:pPr>
+        <w:pStyle w:val="NormalWeb"/>
+        <w:spacing w:line="360" w:lineRule="auto"/>
+        <w:ind w:firstLine="567"/>
+        <w:jc w:val="both"/>
+        <w:rPr>
+          <w:i/>
+        </w:rPr>
+      </w:pPr>
+      <w:r>
+        <w:rPr>
+          <w:i/>
+        </w:rPr>
         <w:t>"As melhores soluções não substituem o que já funciona. Potenciam aquilo que já é feito com excelência."</w:t>
       </w:r>
     </w:p>
     <w:p>
       <w:pPr>
-        <w:pStyle w:val="Ttulo1"/>
-        <w:spacing w:before="0" w:beforeAutospacing="0" w:line="360" w:lineRule="auto"/>
-        <w:ind w:firstLine="567"/>
-        <w:jc w:val="both"/>
-        <w:rPr>
-          <w:sz w:val="24"/>
-          <w:szCs w:val="24"/>
-        </w:rPr>
-      </w:pPr>
-      <w:r>
-        <w:rPr>
-          <w:sz w:val="24"/>
-          <w:szCs w:val="24"/>
-        </w:rPr>
-        <w:t>7. A SOLUÇÃO PROPOSTA</w:t>
-      </w:r>
-    </w:p>
-    <w:p>
-      <w:pPr>
-        <w:pStyle w:val="Ttulo2"/>
-        <w:spacing w:before="0" w:line="360" w:lineRule="auto"/>
-        <w:ind w:firstLine="567"/>
-        <w:jc w:val="both"/>
-        <w:rPr>
-          <w:rFonts w:ascii="Times New Roman" w:hAnsi="Times New Roman" w:cs="Times New Roman"/>
-          <w:sz w:val="24"/>
-          <w:szCs w:val="24"/>
-        </w:rPr>
-      </w:pPr>
-      <w:r>
-        <w:rPr>
-          <w:rFonts w:ascii="Times New Roman" w:hAnsi="Times New Roman" w:cs="Times New Roman"/>
-          <w:sz w:val="24"/>
-          <w:szCs w:val="24"/>
-        </w:rPr>
-        <w:t>Uma visão integrada para a presença institucional</w:t>
-      </w:r>
-    </w:p>
-    <w:p>
-      <w:pPr>
         <w:pStyle w:val="NormalWeb"/>
         <w:spacing w:before="0" w:beforeAutospacing="0" w:line="360" w:lineRule="auto"/>
         <w:ind w:firstLine="567"/>
@@ -3260,27 +3019,6 @@
     </w:p>
     <w:p>
       <w:pPr>
-        <w:pStyle w:val="Ttulo2"/>
-        <w:spacing w:before="0" w:line="360" w:lineRule="auto"/>
-        <w:ind w:firstLine="567"/>
-        <w:jc w:val="both"/>
-        <w:rPr>
-          <w:rFonts w:ascii="Times New Roman" w:hAnsi="Times New Roman" w:cs="Times New Roman"/>
-          <w:sz w:val="24"/>
-          <w:szCs w:val="24"/>
-        </w:rPr>
-      </w:pPr>
-      <w:r>
-        <w:rPr>
-          <w:rFonts w:ascii="Times New Roman" w:hAnsi="Times New Roman" w:cs="Times New Roman"/>
-          <w:sz w:val="24"/>
-          <w:szCs w:val="24"/>
-        </w:rPr>
-        <w:t>Uma plataforma construída para crescer</w:t>
-      </w:r>
-    </w:p>
-    <w:p>
-      <w:pPr>
         <w:pStyle w:val="NormalWeb"/>
         <w:spacing w:before="0" w:beforeAutospacing="0" w:line="360" w:lineRule="auto"/>
         <w:ind w:firstLine="567"/>
@@ -3310,27 +3048,6 @@
       </w:pPr>
       <w:r>
         <w:t>Esta abordagem permitirá que a transformação digital aconteça de forma gradual, respeitando o ritmo de crescimento da instituição e os seus objetivos estratégicos.</w:t>
-      </w:r>
-    </w:p>
-    <w:p>
-      <w:pPr>
-        <w:pStyle w:val="Ttulo2"/>
-        <w:spacing w:before="0" w:line="360" w:lineRule="auto"/>
-        <w:ind w:firstLine="567"/>
-        <w:jc w:val="both"/>
-        <w:rPr>
-          <w:rFonts w:ascii="Times New Roman" w:hAnsi="Times New Roman" w:cs="Times New Roman"/>
-          <w:sz w:val="24"/>
-          <w:szCs w:val="24"/>
-        </w:rPr>
-      </w:pPr>
-      <w:r>
-        <w:rPr>
-          <w:rFonts w:ascii="Times New Roman" w:hAnsi="Times New Roman" w:cs="Times New Roman"/>
-          <w:sz w:val="24"/>
-          <w:szCs w:val="24"/>
-        </w:rPr>
-        <w:t>Estrutura funcional da plataforma</w:t>
       </w:r>
     </w:p>
     <w:p>
@@ -3386,7 +3103,6 @@
         <w:jc w:val="both"/>
       </w:pPr>
       <w:r>
-        <w:lastRenderedPageBreak/>
         <w:t>Apresentação dos cursos e da oferta formativa;</w:t>
       </w:r>
     </w:p>
@@ -3432,6 +3148,7 @@
         <w:jc w:val="both"/>
       </w:pPr>
       <w:r>
+        <w:lastRenderedPageBreak/>
         <w:t>Informações sobre processos de candidatura e matrícula;</w:t>
       </w:r>
     </w:p>
@@ -3493,27 +3210,6 @@
     </w:p>
     <w:p>
       <w:pPr>
-        <w:pStyle w:val="Ttulo2"/>
-        <w:spacing w:before="0" w:line="360" w:lineRule="auto"/>
-        <w:ind w:firstLine="567"/>
-        <w:jc w:val="both"/>
-        <w:rPr>
-          <w:rFonts w:ascii="Times New Roman" w:hAnsi="Times New Roman" w:cs="Times New Roman"/>
-          <w:sz w:val="24"/>
-          <w:szCs w:val="24"/>
-        </w:rPr>
-      </w:pPr>
-      <w:r>
-        <w:rPr>
-          <w:rFonts w:ascii="Times New Roman" w:hAnsi="Times New Roman" w:cs="Times New Roman"/>
-          <w:sz w:val="24"/>
-          <w:szCs w:val="24"/>
-        </w:rPr>
-        <w:t>Uma plataforma pensada para todos</w:t>
-      </w:r>
-    </w:p>
-    <w:p>
-      <w:pPr>
         <w:pStyle w:val="NormalWeb"/>
         <w:spacing w:before="0" w:beforeAutospacing="0" w:line="360" w:lineRule="auto"/>
         <w:ind w:firstLine="567"/>
@@ -3576,27 +3272,6 @@
       </w:pPr>
       <w:r>
         <w:t>Desta forma, a plataforma torna-se um ponto de encontro entre o Instituto e toda a comunidade académica.</w:t>
-      </w:r>
-    </w:p>
-    <w:p>
-      <w:pPr>
-        <w:pStyle w:val="Ttulo2"/>
-        <w:spacing w:before="0" w:line="360" w:lineRule="auto"/>
-        <w:ind w:firstLine="567"/>
-        <w:jc w:val="both"/>
-        <w:rPr>
-          <w:rFonts w:ascii="Times New Roman" w:hAnsi="Times New Roman" w:cs="Times New Roman"/>
-          <w:sz w:val="24"/>
-          <w:szCs w:val="24"/>
-        </w:rPr>
-      </w:pPr>
-      <w:r>
-        <w:rPr>
-          <w:rFonts w:ascii="Times New Roman" w:hAnsi="Times New Roman" w:cs="Times New Roman"/>
-          <w:sz w:val="24"/>
-          <w:szCs w:val="24"/>
-        </w:rPr>
-        <w:t>Uma base para o futuro</w:t>
       </w:r>
     </w:p>
     <w:p>
@@ -3667,7 +3342,6 @@
         <w:jc w:val="both"/>
       </w:pPr>
       <w:r>
-        <w:lastRenderedPageBreak/>
         <w:t>Consultas de horários;</w:t>
       </w:r>
     </w:p>
@@ -3743,6 +3417,7 @@
         <w:jc w:val="both"/>
       </w:pPr>
       <w:r>
+        <w:lastRenderedPageBreak/>
         <w:t>Integração com sistemas administrativos.</w:t>
       </w:r>
     </w:p>
@@ -3779,18 +3454,38 @@
     </w:p>
     <w:p>
       <w:pPr>
-        <w:spacing w:line="360" w:lineRule="auto"/>
-        <w:ind w:firstLine="567"/>
-        <w:jc w:val="both"/>
-        <w:rPr>
-          <w:rFonts w:ascii="Times New Roman" w:hAnsi="Times New Roman" w:cs="Times New Roman"/>
-          <w:sz w:val="24"/>
-          <w:szCs w:val="24"/>
-        </w:rPr>
-      </w:pPr>
-      <w:r>
-        <w:rPr>
-          <w:rFonts w:ascii="Times New Roman" w:hAnsi="Times New Roman" w:cs="Times New Roman"/>
+        <w:pStyle w:val="Ttulo1"/>
+        <w:spacing w:line="360" w:lineRule="auto"/>
+        <w:jc w:val="both"/>
+        <w:rPr>
+          <w:sz w:val="24"/>
+          <w:szCs w:val="24"/>
+        </w:rPr>
+      </w:pPr>
+      <w:r>
+        <w:rPr>
+          <w:sz w:val="24"/>
+          <w:szCs w:val="24"/>
+        </w:rPr>
+        <w:t>8. BENEFÍCIOS PARA A INSTITUIÇÃO</w:t>
+      </w:r>
+    </w:p>
+    <w:p>
+      <w:pPr>
+        <w:spacing w:line="360" w:lineRule="auto"/>
+        <w:ind w:firstLine="567"/>
+        <w:jc w:val="both"/>
+        <w:rPr>
+          <w:rFonts w:ascii="Times New Roman" w:hAnsi="Times New Roman" w:cs="Times New Roman"/>
+          <w:i/>
+          <w:sz w:val="24"/>
+          <w:szCs w:val="24"/>
+        </w:rPr>
+      </w:pPr>
+      <w:r>
+        <w:rPr>
+          <w:rFonts w:ascii="Times New Roman" w:hAnsi="Times New Roman" w:cs="Times New Roman"/>
+          <w:i/>
           <w:sz w:val="24"/>
           <w:szCs w:val="24"/>
         </w:rPr>
@@ -3799,373 +3494,396 @@
     </w:p>
     <w:p>
       <w:pPr>
-        <w:pStyle w:val="Ttulo1"/>
-        <w:spacing w:line="360" w:lineRule="auto"/>
-        <w:ind w:firstLine="567"/>
-        <w:jc w:val="both"/>
-        <w:rPr>
-          <w:sz w:val="24"/>
-          <w:szCs w:val="24"/>
-        </w:rPr>
-      </w:pPr>
-      <w:r>
-        <w:rPr>
-          <w:sz w:val="24"/>
-          <w:szCs w:val="24"/>
-        </w:rPr>
-        <w:t>8. Benefícios para a Instituição</w:t>
+        <w:pStyle w:val="NormalWeb"/>
+        <w:spacing w:line="360" w:lineRule="auto"/>
+        <w:ind w:firstLine="567"/>
+        <w:jc w:val="both"/>
+      </w:pPr>
+      <w:r>
+        <w:t>O Projeto Conecta Lureframulu &amp; Precimuel foi concebido para produzir benefícios que ultrapassam a implementação de uma Plataforma Institucional Digital. A proposta pretende gerar valor para toda a comunidade académica, fortalecer a imagem do Instituto e criar condições para uma evolução institucional sustentável.</w:t>
+      </w:r>
+    </w:p>
+    <w:p>
+      <w:pPr>
+        <w:pStyle w:val="NormalWeb"/>
+        <w:spacing w:line="360" w:lineRule="auto"/>
+        <w:ind w:firstLine="567"/>
+        <w:jc w:val="both"/>
+      </w:pPr>
+      <w:r>
+        <w:t>Os benefícios esperados refletem-se na forma como a instituição comunica, organiza a informação, aproxima-se da comunidade e prepara o seu crescimento futuro.</w:t>
       </w:r>
     </w:p>
     <w:p>
       <w:pPr>
         <w:pStyle w:val="Ttulo2"/>
-        <w:spacing w:line="360" w:lineRule="auto"/>
-        <w:ind w:firstLine="567"/>
-        <w:jc w:val="both"/>
-        <w:rPr>
-          <w:rFonts w:ascii="Times New Roman" w:hAnsi="Times New Roman" w:cs="Times New Roman"/>
-          <w:sz w:val="24"/>
-          <w:szCs w:val="24"/>
-        </w:rPr>
-      </w:pPr>
-      <w:r>
-        <w:rPr>
-          <w:rFonts w:ascii="Times New Roman" w:hAnsi="Times New Roman" w:cs="Times New Roman"/>
-          <w:sz w:val="24"/>
-          <w:szCs w:val="24"/>
-        </w:rPr>
-        <w:t>Um investimento que gera valor em diferentes dimensões</w:t>
-      </w:r>
-    </w:p>
-    <w:p>
-      <w:pPr>
-        <w:pStyle w:val="NormalWeb"/>
-        <w:spacing w:line="360" w:lineRule="auto"/>
-        <w:ind w:firstLine="567"/>
-        <w:jc w:val="both"/>
-      </w:pPr>
-      <w:r>
-        <w:t>O Projeto Conecta Lureframulu &amp; Precimuel foi concebido para produzir benefícios que ultrapassam a implementação de uma Plataforma Institucional Digital. A proposta pretende gerar valor para toda a comunidade académica, fortalecer a imagem do Instituto e criar condições para uma evolução institucional sustentável.</w:t>
-      </w:r>
-    </w:p>
-    <w:p>
-      <w:pPr>
-        <w:pStyle w:val="NormalWeb"/>
-        <w:spacing w:line="360" w:lineRule="auto"/>
-        <w:ind w:firstLine="567"/>
-        <w:jc w:val="both"/>
-      </w:pPr>
-      <w:r>
-        <w:t>Os benefícios esperados refletem-se na forma como a instituição comunica, organiza a informação, aproxima-se da comunidade e prepara o seu crescimento futuro.</w:t>
+        <w:numPr>
+          <w:ilvl w:val="1"/>
+          <w:numId w:val="1"/>
+        </w:numPr>
+        <w:spacing w:line="360" w:lineRule="auto"/>
+        <w:ind w:left="426"/>
+        <w:jc w:val="both"/>
+        <w:rPr>
+          <w:rFonts w:ascii="Times New Roman" w:hAnsi="Times New Roman" w:cs="Times New Roman"/>
+          <w:b/>
+          <w:color w:val="auto"/>
+          <w:sz w:val="24"/>
+          <w:szCs w:val="24"/>
+        </w:rPr>
+      </w:pPr>
+      <w:r>
+        <w:rPr>
+          <w:rFonts w:ascii="Times New Roman" w:hAnsi="Times New Roman" w:cs="Times New Roman"/>
+          <w:b/>
+          <w:color w:val="auto"/>
+          <w:sz w:val="24"/>
+          <w:szCs w:val="24"/>
+        </w:rPr>
+        <w:t>Benefícios para a Direção</w:t>
+      </w:r>
+    </w:p>
+    <w:p>
+      <w:pPr>
+        <w:pStyle w:val="NormalWeb"/>
+        <w:spacing w:line="360" w:lineRule="auto"/>
+        <w:ind w:firstLine="567"/>
+        <w:jc w:val="both"/>
+      </w:pPr>
+      <w:r>
+        <w:t>A Direção passará a dispor de um canal oficial de comunicação que representa a instituição de forma consistente e profissional, permitindo divulgar informações relevantes, reforçar a imagem institucional e acompanhar a evolução da presença digital do Instituto.</w:t>
+      </w:r>
+    </w:p>
+    <w:p>
+      <w:pPr>
+        <w:pStyle w:val="NormalWeb"/>
+        <w:spacing w:line="360" w:lineRule="auto"/>
+        <w:ind w:firstLine="567"/>
+        <w:jc w:val="both"/>
+      </w:pPr>
+      <w:r>
+        <w:t>Além disso, a plataforma contribuirá para consolidar a identidade institucional, valorizando o trabalho desenvolvido ao longo dos anos e ampliando o alcance das estratégias de divulgação já implementadas.</w:t>
       </w:r>
     </w:p>
     <w:p>
       <w:pPr>
         <w:pStyle w:val="Ttulo2"/>
-        <w:spacing w:line="360" w:lineRule="auto"/>
-        <w:ind w:firstLine="567"/>
-        <w:jc w:val="both"/>
-        <w:rPr>
-          <w:rFonts w:ascii="Times New Roman" w:hAnsi="Times New Roman" w:cs="Times New Roman"/>
-          <w:sz w:val="24"/>
-          <w:szCs w:val="24"/>
-        </w:rPr>
-      </w:pPr>
-      <w:r>
-        <w:rPr>
-          <w:rFonts w:ascii="Times New Roman" w:hAnsi="Times New Roman" w:cs="Times New Roman"/>
-          <w:sz w:val="24"/>
-          <w:szCs w:val="24"/>
-        </w:rPr>
-        <w:t>Benefícios para a Direção</w:t>
-      </w:r>
-    </w:p>
-    <w:p>
-      <w:pPr>
-        <w:pStyle w:val="NormalWeb"/>
-        <w:spacing w:line="360" w:lineRule="auto"/>
-        <w:ind w:firstLine="567"/>
-        <w:jc w:val="both"/>
-      </w:pPr>
-      <w:r>
-        <w:t>A Direção passará a dispor de um canal oficial de comunicação que representa a instituição de forma consistente e profissional, permitindo divulgar informações relevantes, reforçar a imagem institucional e acompanhar a evolução da presença digital do Instituto.</w:t>
-      </w:r>
-    </w:p>
-    <w:p>
-      <w:pPr>
-        <w:pStyle w:val="NormalWeb"/>
-        <w:spacing w:line="360" w:lineRule="auto"/>
-        <w:ind w:firstLine="567"/>
-        <w:jc w:val="both"/>
-      </w:pPr>
-      <w:r>
+        <w:numPr>
+          <w:ilvl w:val="1"/>
+          <w:numId w:val="1"/>
+        </w:numPr>
+        <w:spacing w:line="360" w:lineRule="auto"/>
+        <w:ind w:left="426"/>
+        <w:jc w:val="both"/>
+        <w:rPr>
+          <w:rFonts w:ascii="Times New Roman" w:hAnsi="Times New Roman" w:cs="Times New Roman"/>
+          <w:b/>
+          <w:color w:val="auto"/>
+          <w:sz w:val="24"/>
+          <w:szCs w:val="24"/>
+        </w:rPr>
+      </w:pPr>
+      <w:r>
+        <w:rPr>
+          <w:rFonts w:ascii="Times New Roman" w:hAnsi="Times New Roman" w:cs="Times New Roman"/>
+          <w:b/>
+          <w:color w:val="auto"/>
+          <w:sz w:val="24"/>
+          <w:szCs w:val="24"/>
+        </w:rPr>
         <w:lastRenderedPageBreak/>
-        <w:t>Além disso, a plataforma contribuirá para consolidar a identidade institucional, valorizando o trabalho desenvolvido ao longo dos anos e ampliando o alcance das estratégias de divulgação já implementadas.</w:t>
+        <w:t>Benefícios para a gestão institucional</w:t>
+      </w:r>
+    </w:p>
+    <w:p>
+      <w:pPr>
+        <w:pStyle w:val="NormalWeb"/>
+        <w:spacing w:line="360" w:lineRule="auto"/>
+        <w:ind w:firstLine="567"/>
+        <w:jc w:val="both"/>
+      </w:pPr>
+      <w:r>
+        <w:t>A centralização das informações num único ambiente facilitará a organização da comunicação institucional, reduzindo a dispersão de conteúdos e permitindo uma atualização mais eficiente das informações disponibilizadas ao público.</w:t>
+      </w:r>
+    </w:p>
+    <w:p>
+      <w:pPr>
+        <w:pStyle w:val="NormalWeb"/>
+        <w:spacing w:line="360" w:lineRule="auto"/>
+        <w:ind w:firstLine="567"/>
+        <w:jc w:val="both"/>
+      </w:pPr>
+      <w:r>
+        <w:t>Esta organização contribuirá para melhorar os processos internos relacionados com a divulgação institucional e criará uma base preparada para futuras iniciativas de transformação digital.</w:t>
       </w:r>
     </w:p>
     <w:p>
       <w:pPr>
         <w:pStyle w:val="Ttulo2"/>
-        <w:spacing w:line="360" w:lineRule="auto"/>
-        <w:ind w:firstLine="567"/>
-        <w:jc w:val="both"/>
-        <w:rPr>
-          <w:rFonts w:ascii="Times New Roman" w:hAnsi="Times New Roman" w:cs="Times New Roman"/>
-          <w:sz w:val="24"/>
-          <w:szCs w:val="24"/>
-        </w:rPr>
-      </w:pPr>
-      <w:r>
-        <w:rPr>
-          <w:rFonts w:ascii="Times New Roman" w:hAnsi="Times New Roman" w:cs="Times New Roman"/>
-          <w:sz w:val="24"/>
-          <w:szCs w:val="24"/>
-        </w:rPr>
-        <w:t>Benefícios para a gestão institucional</w:t>
-      </w:r>
-    </w:p>
-    <w:p>
-      <w:pPr>
-        <w:pStyle w:val="NormalWeb"/>
-        <w:spacing w:line="360" w:lineRule="auto"/>
-        <w:ind w:firstLine="567"/>
-        <w:jc w:val="both"/>
-      </w:pPr>
-      <w:r>
-        <w:t>A centralização das informações num único ambiente facilitará a organização da comunicação institucional, reduzindo a dispersão de conteúdos e permitindo uma atualização mais eficiente das informações disponibilizadas ao público.</w:t>
-      </w:r>
-    </w:p>
-    <w:p>
-      <w:pPr>
-        <w:pStyle w:val="NormalWeb"/>
-        <w:spacing w:line="360" w:lineRule="auto"/>
-        <w:ind w:firstLine="567"/>
-        <w:jc w:val="both"/>
-      </w:pPr>
-      <w:r>
-        <w:t>Esta organização contribuirá para melhorar os processos internos relacionados com a divulgação institucional e criará uma base preparada para futuras iniciativas de transformação digital.</w:t>
+        <w:numPr>
+          <w:ilvl w:val="1"/>
+          <w:numId w:val="1"/>
+        </w:numPr>
+        <w:spacing w:line="360" w:lineRule="auto"/>
+        <w:ind w:left="426"/>
+        <w:jc w:val="both"/>
+        <w:rPr>
+          <w:rFonts w:ascii="Times New Roman" w:hAnsi="Times New Roman" w:cs="Times New Roman"/>
+          <w:b/>
+          <w:color w:val="auto"/>
+          <w:sz w:val="24"/>
+          <w:szCs w:val="24"/>
+        </w:rPr>
+      </w:pPr>
+      <w:r>
+        <w:rPr>
+          <w:rFonts w:ascii="Times New Roman" w:hAnsi="Times New Roman" w:cs="Times New Roman"/>
+          <w:b/>
+          <w:color w:val="auto"/>
+          <w:sz w:val="24"/>
+          <w:szCs w:val="24"/>
+        </w:rPr>
+        <w:t>Benefícios para os estudantes</w:t>
+      </w:r>
+    </w:p>
+    <w:p>
+      <w:pPr>
+        <w:pStyle w:val="NormalWeb"/>
+        <w:spacing w:line="360" w:lineRule="auto"/>
+        <w:ind w:firstLine="567"/>
+        <w:jc w:val="both"/>
+      </w:pPr>
+      <w:r>
+        <w:t>Os estudantes terão acesso rápido e permanente às principais informações institucionais, incluindo notícias, eventos, calendários, atividades e outros conteúdos relevantes para a sua vida académica.</w:t>
+      </w:r>
+    </w:p>
+    <w:p>
+      <w:pPr>
+        <w:pStyle w:val="NormalWeb"/>
+        <w:spacing w:line="360" w:lineRule="auto"/>
+        <w:ind w:firstLine="567"/>
+        <w:jc w:val="both"/>
+      </w:pPr>
+      <w:r>
+        <w:t>A facilidade de acesso à informação contribuirá para uma experiência mais organizada e para uma relação mais próxima com a instituição.</w:t>
       </w:r>
     </w:p>
     <w:p>
       <w:pPr>
         <w:pStyle w:val="Ttulo2"/>
-        <w:spacing w:line="360" w:lineRule="auto"/>
-        <w:ind w:firstLine="567"/>
-        <w:jc w:val="both"/>
-        <w:rPr>
-          <w:rFonts w:ascii="Times New Roman" w:hAnsi="Times New Roman" w:cs="Times New Roman"/>
-          <w:sz w:val="24"/>
-          <w:szCs w:val="24"/>
-        </w:rPr>
-      </w:pPr>
-      <w:r>
-        <w:rPr>
-          <w:rFonts w:ascii="Times New Roman" w:hAnsi="Times New Roman" w:cs="Times New Roman"/>
-          <w:sz w:val="24"/>
-          <w:szCs w:val="24"/>
-        </w:rPr>
-        <w:t>Benefícios para os estudantes</w:t>
-      </w:r>
-    </w:p>
-    <w:p>
-      <w:pPr>
-        <w:pStyle w:val="NormalWeb"/>
-        <w:spacing w:line="360" w:lineRule="auto"/>
-        <w:ind w:firstLine="567"/>
-        <w:jc w:val="both"/>
-      </w:pPr>
-      <w:r>
-        <w:t>Os estudantes terão acesso rápido e permanente às principais informações institucionais, incluindo notícias, eventos, calendários, atividades e outros conteúdos relevantes para a sua vida académica.</w:t>
-      </w:r>
-    </w:p>
-    <w:p>
-      <w:pPr>
-        <w:pStyle w:val="NormalWeb"/>
-        <w:spacing w:line="360" w:lineRule="auto"/>
-        <w:ind w:firstLine="567"/>
-        <w:jc w:val="both"/>
-      </w:pPr>
-      <w:r>
-        <w:t>A facilidade de acesso à informação contribuirá para uma experiência mais organizada e para uma relação mais próxima com a instituição.</w:t>
+        <w:numPr>
+          <w:ilvl w:val="1"/>
+          <w:numId w:val="1"/>
+        </w:numPr>
+        <w:spacing w:line="360" w:lineRule="auto"/>
+        <w:ind w:left="426"/>
+        <w:jc w:val="both"/>
+        <w:rPr>
+          <w:rFonts w:ascii="Times New Roman" w:hAnsi="Times New Roman" w:cs="Times New Roman"/>
+          <w:b/>
+          <w:color w:val="auto"/>
+          <w:sz w:val="24"/>
+          <w:szCs w:val="24"/>
+        </w:rPr>
+      </w:pPr>
+      <w:r>
+        <w:rPr>
+          <w:rFonts w:ascii="Times New Roman" w:hAnsi="Times New Roman" w:cs="Times New Roman"/>
+          <w:b/>
+          <w:color w:val="auto"/>
+          <w:sz w:val="24"/>
+          <w:szCs w:val="24"/>
+        </w:rPr>
+        <w:t>Benefícios para os encarregados de educação</w:t>
+      </w:r>
+    </w:p>
+    <w:p>
+      <w:pPr>
+        <w:pStyle w:val="NormalWeb"/>
+        <w:spacing w:line="360" w:lineRule="auto"/>
+        <w:ind w:firstLine="567"/>
+        <w:jc w:val="both"/>
+      </w:pPr>
+      <w:r>
+        <w:t>Os encarregados de educação poderão conhecer melhor o Instituto, acompanhar informações importantes e encontrar facilmente os contactos e serviços disponibilizados pela instituição.</w:t>
+      </w:r>
+    </w:p>
+    <w:p>
+      <w:pPr>
+        <w:pStyle w:val="NormalWeb"/>
+        <w:spacing w:line="360" w:lineRule="auto"/>
+        <w:ind w:firstLine="567"/>
+        <w:jc w:val="both"/>
+      </w:pPr>
+      <w:r>
+        <w:t>Esta proximidade reforçará a confiança na comunicação institucional e facilitará o relacionamento entre as famílias e o Instituto.</w:t>
       </w:r>
     </w:p>
     <w:p>
       <w:pPr>
         <w:pStyle w:val="Ttulo2"/>
-        <w:spacing w:line="360" w:lineRule="auto"/>
-        <w:ind w:firstLine="567"/>
-        <w:jc w:val="both"/>
-        <w:rPr>
-          <w:rFonts w:ascii="Times New Roman" w:hAnsi="Times New Roman" w:cs="Times New Roman"/>
-          <w:sz w:val="24"/>
-          <w:szCs w:val="24"/>
-        </w:rPr>
-      </w:pPr>
-      <w:r>
-        <w:rPr>
-          <w:rFonts w:ascii="Times New Roman" w:hAnsi="Times New Roman" w:cs="Times New Roman"/>
-          <w:sz w:val="24"/>
-          <w:szCs w:val="24"/>
-        </w:rPr>
-        <w:t>Benefícios para os encarregados de educação</w:t>
-      </w:r>
-    </w:p>
-    <w:p>
-      <w:pPr>
-        <w:pStyle w:val="NormalWeb"/>
-        <w:spacing w:line="360" w:lineRule="auto"/>
-        <w:ind w:firstLine="567"/>
-        <w:jc w:val="both"/>
-      </w:pPr>
-      <w:r>
-        <w:t>Os encarregados de educação poderão conhecer melhor o Instituto, acompanhar informações importantes e encontrar facilmente os contactos e serviços disponibilizados pela instituição.</w:t>
-      </w:r>
-    </w:p>
-    <w:p>
-      <w:pPr>
-        <w:pStyle w:val="NormalWeb"/>
-        <w:spacing w:line="360" w:lineRule="auto"/>
-        <w:ind w:firstLine="567"/>
-        <w:jc w:val="both"/>
-      </w:pPr>
-      <w:r>
-        <w:t>Esta proximidade reforçará a confiança na comunicação institucional e facilitará o relacionamento entre as famílias e o Instituto.</w:t>
+        <w:numPr>
+          <w:ilvl w:val="1"/>
+          <w:numId w:val="1"/>
+        </w:numPr>
+        <w:spacing w:line="360" w:lineRule="auto"/>
+        <w:ind w:left="426"/>
+        <w:jc w:val="both"/>
+        <w:rPr>
+          <w:rFonts w:ascii="Times New Roman" w:hAnsi="Times New Roman" w:cs="Times New Roman"/>
+          <w:b/>
+          <w:color w:val="auto"/>
+          <w:sz w:val="24"/>
+          <w:szCs w:val="24"/>
+        </w:rPr>
+      </w:pPr>
+      <w:r>
+        <w:rPr>
+          <w:rFonts w:ascii="Times New Roman" w:hAnsi="Times New Roman" w:cs="Times New Roman"/>
+          <w:b/>
+          <w:color w:val="auto"/>
+          <w:sz w:val="24"/>
+          <w:szCs w:val="24"/>
+        </w:rPr>
+        <w:t>Benefícios para os docentes e colaboradores</w:t>
+      </w:r>
+    </w:p>
+    <w:p>
+      <w:pPr>
+        <w:pStyle w:val="NormalWeb"/>
+        <w:spacing w:line="360" w:lineRule="auto"/>
+        <w:ind w:firstLine="567"/>
+        <w:jc w:val="both"/>
+      </w:pPr>
+      <w:r>
+        <w:t>A plataforma permitirá divulgar atividades académicas, projetos, iniciativas institucionais e outras informações relevantes, fortalecendo a comunicação interna e valorizando o trabalho desenvolvido pelos profissionais que integram o Instituto.</w:t>
       </w:r>
     </w:p>
     <w:p>
       <w:pPr>
         <w:pStyle w:val="Ttulo2"/>
-        <w:spacing w:line="360" w:lineRule="auto"/>
-        <w:ind w:firstLine="567"/>
-        <w:jc w:val="both"/>
-        <w:rPr>
-          <w:rFonts w:ascii="Times New Roman" w:hAnsi="Times New Roman" w:cs="Times New Roman"/>
-          <w:sz w:val="24"/>
-          <w:szCs w:val="24"/>
-        </w:rPr>
-      </w:pPr>
-      <w:r>
-        <w:rPr>
-          <w:rFonts w:ascii="Times New Roman" w:hAnsi="Times New Roman" w:cs="Times New Roman"/>
-          <w:sz w:val="24"/>
-          <w:szCs w:val="24"/>
-        </w:rPr>
-        <w:t>Benefícios para os docentes e colaboradores</w:t>
-      </w:r>
-    </w:p>
-    <w:p>
-      <w:pPr>
-        <w:pStyle w:val="NormalWeb"/>
-        <w:spacing w:line="360" w:lineRule="auto"/>
-        <w:ind w:firstLine="567"/>
-        <w:jc w:val="both"/>
-      </w:pPr>
-      <w:r>
-        <w:t>A plataforma permitirá divulgar atividades académicas, projetos, iniciativas institucionais e outras informações relevantes, fortalecendo a comunicação interna e valorizando o trabalho desenvolvido pelos profissionais que integram o Instituto.</w:t>
+        <w:numPr>
+          <w:ilvl w:val="1"/>
+          <w:numId w:val="1"/>
+        </w:numPr>
+        <w:spacing w:line="360" w:lineRule="auto"/>
+        <w:ind w:left="426"/>
+        <w:jc w:val="both"/>
+        <w:rPr>
+          <w:rFonts w:ascii="Times New Roman" w:hAnsi="Times New Roman" w:cs="Times New Roman"/>
+          <w:b/>
+          <w:color w:val="auto"/>
+          <w:sz w:val="24"/>
+          <w:szCs w:val="24"/>
+        </w:rPr>
+      </w:pPr>
+      <w:r>
+        <w:rPr>
+          <w:rFonts w:ascii="Times New Roman" w:hAnsi="Times New Roman" w:cs="Times New Roman"/>
+          <w:b/>
+          <w:color w:val="auto"/>
+          <w:sz w:val="24"/>
+          <w:szCs w:val="24"/>
+        </w:rPr>
+        <w:t>Benefícios para a imagem institucional</w:t>
+      </w:r>
+    </w:p>
+    <w:p>
+      <w:pPr>
+        <w:pStyle w:val="NormalWeb"/>
+        <w:spacing w:line="360" w:lineRule="auto"/>
+        <w:ind w:firstLine="567"/>
+        <w:jc w:val="both"/>
+      </w:pPr>
+      <w:r>
+        <w:t>Uma presença digital moderna, organizada e permanentemente atualizada transmite profissionalismo, credibilidade e compromisso com a qualidade.</w:t>
+      </w:r>
+    </w:p>
+    <w:p>
+      <w:pPr>
+        <w:pStyle w:val="NormalWeb"/>
+        <w:spacing w:line="360" w:lineRule="auto"/>
+        <w:ind w:firstLine="567"/>
+        <w:jc w:val="both"/>
+      </w:pPr>
+      <w:r>
+        <w:lastRenderedPageBreak/>
+        <w:t>Ao integrar a comunicação tradicional com os meios digitais, o Instituto reforçará a sua identidade institucional e ampliará a sua capacidade de alcançar novos públicos, consolidando a sua posição como referência na formação técnica em saúde.</w:t>
       </w:r>
     </w:p>
     <w:p>
       <w:pPr>
         <w:pStyle w:val="Ttulo2"/>
-        <w:spacing w:line="360" w:lineRule="auto"/>
-        <w:ind w:firstLine="567"/>
-        <w:jc w:val="both"/>
-        <w:rPr>
-          <w:rFonts w:ascii="Times New Roman" w:hAnsi="Times New Roman" w:cs="Times New Roman"/>
-          <w:sz w:val="24"/>
-          <w:szCs w:val="24"/>
-        </w:rPr>
-      </w:pPr>
-      <w:r>
-        <w:rPr>
-          <w:rFonts w:ascii="Times New Roman" w:hAnsi="Times New Roman" w:cs="Times New Roman"/>
-          <w:sz w:val="24"/>
-          <w:szCs w:val="24"/>
-        </w:rPr>
-        <w:lastRenderedPageBreak/>
-        <w:t>Benefícios para a imagem institucional</w:t>
-      </w:r>
-    </w:p>
-    <w:p>
-      <w:pPr>
-        <w:pStyle w:val="NormalWeb"/>
-        <w:spacing w:line="360" w:lineRule="auto"/>
-        <w:ind w:firstLine="567"/>
-        <w:jc w:val="both"/>
-      </w:pPr>
-      <w:r>
-        <w:t>Uma presença digital moderna, organizada e permanentemente atualizada transmite profissionalismo, credibilidade e compromisso com a qualidade.</w:t>
-      </w:r>
-    </w:p>
-    <w:p>
-      <w:pPr>
-        <w:pStyle w:val="NormalWeb"/>
-        <w:spacing w:line="360" w:lineRule="auto"/>
-        <w:ind w:firstLine="567"/>
-        <w:jc w:val="both"/>
-      </w:pPr>
-      <w:r>
-        <w:t>Ao integrar a comunicação tradicional com os meios digitais, o Instituto reforçará a sua identidade institucional e ampliará a sua capacidade de alcançar novos públicos, consolidando a sua posição como referência na formação técnica em saúde.</w:t>
+        <w:numPr>
+          <w:ilvl w:val="1"/>
+          <w:numId w:val="1"/>
+        </w:numPr>
+        <w:spacing w:line="360" w:lineRule="auto"/>
+        <w:ind w:left="426"/>
+        <w:jc w:val="both"/>
+        <w:rPr>
+          <w:rFonts w:ascii="Times New Roman" w:hAnsi="Times New Roman" w:cs="Times New Roman"/>
+          <w:b/>
+          <w:sz w:val="24"/>
+          <w:szCs w:val="24"/>
+        </w:rPr>
+      </w:pPr>
+      <w:r>
+        <w:rPr>
+          <w:rFonts w:ascii="Times New Roman" w:hAnsi="Times New Roman" w:cs="Times New Roman"/>
+          <w:b/>
+          <w:color w:val="auto"/>
+          <w:sz w:val="24"/>
+          <w:szCs w:val="24"/>
+        </w:rPr>
+        <w:t>Benefícios para os parceiros institucionais</w:t>
+      </w:r>
+    </w:p>
+    <w:p>
+      <w:pPr>
+        <w:pStyle w:val="NormalWeb"/>
+        <w:spacing w:line="360" w:lineRule="auto"/>
+        <w:ind w:firstLine="567"/>
+        <w:jc w:val="both"/>
+      </w:pPr>
+      <w:r>
+        <w:t>A plataforma facilitará a apresentação da missão, dos projetos e das oportunidades de colaboração do Instituto, criando um ambiente mais favorável para o estabelecimento de parcerias académicas, institucionais e empresariais.</w:t>
+      </w:r>
+    </w:p>
+    <w:p>
+      <w:pPr>
+        <w:pStyle w:val="NormalWeb"/>
+        <w:spacing w:line="360" w:lineRule="auto"/>
+        <w:ind w:firstLine="567"/>
+        <w:jc w:val="both"/>
+      </w:pPr>
+      <w:r>
+        <w:t>Uma comunicação institucional clara e acessível fortalece a confiança dos parceiros e amplia as possibilidades de cooperação.</w:t>
       </w:r>
     </w:p>
     <w:p>
       <w:pPr>
         <w:pStyle w:val="Ttulo2"/>
-        <w:spacing w:line="360" w:lineRule="auto"/>
-        <w:ind w:firstLine="567"/>
-        <w:jc w:val="both"/>
-        <w:rPr>
-          <w:rFonts w:ascii="Times New Roman" w:hAnsi="Times New Roman" w:cs="Times New Roman"/>
-          <w:sz w:val="24"/>
-          <w:szCs w:val="24"/>
-        </w:rPr>
-      </w:pPr>
-      <w:r>
-        <w:rPr>
-          <w:rFonts w:ascii="Times New Roman" w:hAnsi="Times New Roman" w:cs="Times New Roman"/>
-          <w:sz w:val="24"/>
-          <w:szCs w:val="24"/>
-        </w:rPr>
-        <w:t>Benefícios para os parceiros institucionais</w:t>
-      </w:r>
-    </w:p>
-    <w:p>
-      <w:pPr>
-        <w:pStyle w:val="NormalWeb"/>
-        <w:spacing w:line="360" w:lineRule="auto"/>
-        <w:ind w:firstLine="567"/>
-        <w:jc w:val="both"/>
-      </w:pPr>
-      <w:r>
-        <w:t>A plataforma facilitará a apresentação da missão, dos projetos e das oportunidades de colaboração do Instituto, criando um ambiente mais favorável para o estabelecimento de parcerias académicas, institucionais e empresariais.</w:t>
-      </w:r>
-    </w:p>
-    <w:p>
-      <w:pPr>
-        <w:pStyle w:val="NormalWeb"/>
-        <w:spacing w:line="360" w:lineRule="auto"/>
-        <w:ind w:firstLine="567"/>
-        <w:jc w:val="both"/>
-      </w:pPr>
-      <w:r>
-        <w:t>Uma comunicação institucional clara e acessível fortalece a confiança dos parceiros e amplia as possibilidades de cooperação.</w:t>
-      </w:r>
-    </w:p>
-    <w:p>
-      <w:pPr>
-        <w:pStyle w:val="Ttulo2"/>
-        <w:spacing w:line="360" w:lineRule="auto"/>
-        <w:ind w:firstLine="567"/>
-        <w:jc w:val="both"/>
-        <w:rPr>
-          <w:rFonts w:ascii="Times New Roman" w:hAnsi="Times New Roman" w:cs="Times New Roman"/>
-          <w:sz w:val="24"/>
-          <w:szCs w:val="24"/>
-        </w:rPr>
-      </w:pPr>
-      <w:r>
-        <w:rPr>
-          <w:rFonts w:ascii="Times New Roman" w:hAnsi="Times New Roman" w:cs="Times New Roman"/>
+        <w:numPr>
+          <w:ilvl w:val="1"/>
+          <w:numId w:val="1"/>
+        </w:numPr>
+        <w:spacing w:line="360" w:lineRule="auto"/>
+        <w:ind w:left="426"/>
+        <w:jc w:val="both"/>
+        <w:rPr>
+          <w:rFonts w:ascii="Times New Roman" w:hAnsi="Times New Roman" w:cs="Times New Roman"/>
+          <w:b/>
+          <w:color w:val="auto"/>
+          <w:sz w:val="24"/>
+          <w:szCs w:val="24"/>
+        </w:rPr>
+      </w:pPr>
+      <w:r>
+        <w:rPr>
+          <w:rFonts w:ascii="Times New Roman" w:hAnsi="Times New Roman" w:cs="Times New Roman"/>
+          <w:b/>
+          <w:color w:val="auto"/>
           <w:sz w:val="24"/>
           <w:szCs w:val="24"/>
         </w:rPr>
@@ -4257,39 +3975,23 @@
     </w:p>
     <w:p>
       <w:pPr>
-        <w:pStyle w:val="Ttulo2"/>
-        <w:spacing w:line="360" w:lineRule="auto"/>
-        <w:jc w:val="both"/>
-        <w:rPr>
-          <w:rFonts w:ascii="Times New Roman" w:hAnsi="Times New Roman" w:cs="Times New Roman"/>
-          <w:sz w:val="24"/>
-          <w:szCs w:val="24"/>
-        </w:rPr>
-      </w:pPr>
-      <w:r>
-        <w:rPr>
-          <w:rFonts w:ascii="Times New Roman" w:hAnsi="Times New Roman" w:cs="Times New Roman"/>
-          <w:sz w:val="24"/>
-          <w:szCs w:val="24"/>
-        </w:rPr>
-        <w:t>Tecnologia ao serviço da instituição</w:t>
-      </w:r>
-    </w:p>
-    <w:p>
-      <w:pPr>
         <w:spacing w:line="360" w:lineRule="auto"/>
         <w:ind w:firstLine="567"/>
         <w:jc w:val="both"/>
         <w:rPr>
           <w:rFonts w:ascii="Times New Roman" w:eastAsia="Times New Roman" w:hAnsi="Times New Roman" w:cs="Times New Roman"/>
+          <w:i/>
           <w:sz w:val="24"/>
           <w:szCs w:val="24"/>
           <w:lang w:eastAsia="pt-BR"/>
         </w:rPr>
       </w:pPr>
-      <w:r>
-        <w:rPr>
-          <w:rFonts w:ascii="Times New Roman" w:hAnsi="Times New Roman" w:cs="Times New Roman"/>
+      <w:bookmarkStart w:id="0" w:name="_GoBack"/>
+      <w:bookmarkEnd w:id="0"/>
+      <w:r>
+        <w:rPr>
+          <w:rFonts w:ascii="Times New Roman" w:hAnsi="Times New Roman" w:cs="Times New Roman"/>
+          <w:i/>
           <w:sz w:val="24"/>
           <w:szCs w:val="24"/>
         </w:rPr>
@@ -7097,7 +6799,7 @@
   <w:abstractNum w:abstractNumId="2">
     <w:nsid w:val="1CE363D2"/>
     <w:multiLevelType w:val="multilevel"/>
-    <w:tmpl w:val="90B60060"/>
+    <w:tmpl w:val="C2FA832E"/>
     <w:lvl w:ilvl="0">
       <w:start w:val="1"/>
       <w:numFmt w:val="bullet"/>
@@ -7114,6 +6816,499 @@
         <w:sz w:val="20"/>
       </w:rPr>
     </w:lvl>
+    <w:lvl w:ilvl="1">
+      <w:start w:val="1"/>
+      <w:numFmt w:val="lowerLetter"/>
+      <w:lvlText w:val="%2)"/>
+      <w:lvlJc w:val="left"/>
+      <w:pPr>
+        <w:ind w:left="1440" w:hanging="360"/>
+      </w:pPr>
+      <w:rPr>
+        <w:rFonts w:hint="default"/>
+        <w:color w:val="auto"/>
+      </w:rPr>
+    </w:lvl>
+    <w:lvl w:ilvl="2" w:tentative="1">
+      <w:start w:val="1"/>
+      <w:numFmt w:val="bullet"/>
+      <w:lvlText w:val=""/>
+      <w:lvlJc w:val="left"/>
+      <w:pPr>
+        <w:tabs>
+          <w:tab w:val="num" w:pos="2160"/>
+        </w:tabs>
+        <w:ind w:left="2160" w:hanging="360"/>
+      </w:pPr>
+      <w:rPr>
+        <w:rFonts w:ascii="Wingdings" w:hAnsi="Wingdings" w:hint="default"/>
+        <w:sz w:val="20"/>
+      </w:rPr>
+    </w:lvl>
+    <w:lvl w:ilvl="3" w:tentative="1">
+      <w:start w:val="1"/>
+      <w:numFmt w:val="bullet"/>
+      <w:lvlText w:val=""/>
+      <w:lvlJc w:val="left"/>
+      <w:pPr>
+        <w:tabs>
+          <w:tab w:val="num" w:pos="2880"/>
+        </w:tabs>
+        <w:ind w:left="2880" w:hanging="360"/>
+      </w:pPr>
+      <w:rPr>
+        <w:rFonts w:ascii="Wingdings" w:hAnsi="Wingdings" w:hint="default"/>
+        <w:sz w:val="20"/>
+      </w:rPr>
+    </w:lvl>
+    <w:lvl w:ilvl="4" w:tentative="1">
+      <w:start w:val="1"/>
+      <w:numFmt w:val="bullet"/>
+      <w:lvlText w:val=""/>
+      <w:lvlJc w:val="left"/>
+      <w:pPr>
+        <w:tabs>
+          <w:tab w:val="num" w:pos="3600"/>
+        </w:tabs>
+        <w:ind w:left="3600" w:hanging="360"/>
+      </w:pPr>
+      <w:rPr>
+        <w:rFonts w:ascii="Wingdings" w:hAnsi="Wingdings" w:hint="default"/>
+        <w:sz w:val="20"/>
+      </w:rPr>
+    </w:lvl>
+    <w:lvl w:ilvl="5" w:tentative="1">
+      <w:start w:val="1"/>
+      <w:numFmt w:val="bullet"/>
+      <w:lvlText w:val=""/>
+      <w:lvlJc w:val="left"/>
+      <w:pPr>
+        <w:tabs>
+          <w:tab w:val="num" w:pos="4320"/>
+        </w:tabs>
+        <w:ind w:left="4320" w:hanging="360"/>
+      </w:pPr>
+      <w:rPr>
+        <w:rFonts w:ascii="Wingdings" w:hAnsi="Wingdings" w:hint="default"/>
+        <w:sz w:val="20"/>
+      </w:rPr>
+    </w:lvl>
+    <w:lvl w:ilvl="6" w:tentative="1">
+      <w:start w:val="1"/>
+      <w:numFmt w:val="bullet"/>
+      <w:lvlText w:val=""/>
+      <w:lvlJc w:val="left"/>
+      <w:pPr>
+        <w:tabs>
+          <w:tab w:val="num" w:pos="5040"/>
+        </w:tabs>
+        <w:ind w:left="5040" w:hanging="360"/>
+      </w:pPr>
+      <w:rPr>
+        <w:rFonts w:ascii="Wingdings" w:hAnsi="Wingdings" w:hint="default"/>
+        <w:sz w:val="20"/>
+      </w:rPr>
+    </w:lvl>
+    <w:lvl w:ilvl="7" w:tentative="1">
+      <w:start w:val="1"/>
+      <w:numFmt w:val="bullet"/>
+      <w:lvlText w:val=""/>
+      <w:lvlJc w:val="left"/>
+      <w:pPr>
+        <w:tabs>
+          <w:tab w:val="num" w:pos="5760"/>
+        </w:tabs>
+        <w:ind w:left="5760" w:hanging="360"/>
+      </w:pPr>
+      <w:rPr>
+        <w:rFonts w:ascii="Wingdings" w:hAnsi="Wingdings" w:hint="default"/>
+        <w:sz w:val="20"/>
+      </w:rPr>
+    </w:lvl>
+    <w:lvl w:ilvl="8" w:tentative="1">
+      <w:start w:val="1"/>
+      <w:numFmt w:val="bullet"/>
+      <w:lvlText w:val=""/>
+      <w:lvlJc w:val="left"/>
+      <w:pPr>
+        <w:tabs>
+          <w:tab w:val="num" w:pos="6480"/>
+        </w:tabs>
+        <w:ind w:left="6480" w:hanging="360"/>
+      </w:pPr>
+      <w:rPr>
+        <w:rFonts w:ascii="Wingdings" w:hAnsi="Wingdings" w:hint="default"/>
+        <w:sz w:val="20"/>
+      </w:rPr>
+    </w:lvl>
+  </w:abstractNum>
+  <w:abstractNum w:abstractNumId="3">
+    <w:nsid w:val="25236C51"/>
+    <w:multiLevelType w:val="hybridMultilevel"/>
+    <w:tmpl w:val="6286073E"/>
+    <w:lvl w:ilvl="0" w:tplc="04160017">
+      <w:start w:val="1"/>
+      <w:numFmt w:val="lowerLetter"/>
+      <w:lvlText w:val="%1)"/>
+      <w:lvlJc w:val="left"/>
+      <w:pPr>
+        <w:ind w:left="1287" w:hanging="360"/>
+      </w:pPr>
+    </w:lvl>
+    <w:lvl w:ilvl="1" w:tplc="04160019" w:tentative="1">
+      <w:start w:val="1"/>
+      <w:numFmt w:val="lowerLetter"/>
+      <w:lvlText w:val="%2."/>
+      <w:lvlJc w:val="left"/>
+      <w:pPr>
+        <w:ind w:left="2007" w:hanging="360"/>
+      </w:pPr>
+    </w:lvl>
+    <w:lvl w:ilvl="2" w:tplc="0416001B" w:tentative="1">
+      <w:start w:val="1"/>
+      <w:numFmt w:val="lowerRoman"/>
+      <w:lvlText w:val="%3."/>
+      <w:lvlJc w:val="right"/>
+      <w:pPr>
+        <w:ind w:left="2727" w:hanging="180"/>
+      </w:pPr>
+    </w:lvl>
+    <w:lvl w:ilvl="3" w:tplc="0416000F" w:tentative="1">
+      <w:start w:val="1"/>
+      <w:numFmt w:val="decimal"/>
+      <w:lvlText w:val="%4."/>
+      <w:lvlJc w:val="left"/>
+      <w:pPr>
+        <w:ind w:left="3447" w:hanging="360"/>
+      </w:pPr>
+    </w:lvl>
+    <w:lvl w:ilvl="4" w:tplc="04160019" w:tentative="1">
+      <w:start w:val="1"/>
+      <w:numFmt w:val="lowerLetter"/>
+      <w:lvlText w:val="%5."/>
+      <w:lvlJc w:val="left"/>
+      <w:pPr>
+        <w:ind w:left="4167" w:hanging="360"/>
+      </w:pPr>
+    </w:lvl>
+    <w:lvl w:ilvl="5" w:tplc="0416001B" w:tentative="1">
+      <w:start w:val="1"/>
+      <w:numFmt w:val="lowerRoman"/>
+      <w:lvlText w:val="%6."/>
+      <w:lvlJc w:val="right"/>
+      <w:pPr>
+        <w:ind w:left="4887" w:hanging="180"/>
+      </w:pPr>
+    </w:lvl>
+    <w:lvl w:ilvl="6" w:tplc="0416000F" w:tentative="1">
+      <w:start w:val="1"/>
+      <w:numFmt w:val="decimal"/>
+      <w:lvlText w:val="%7."/>
+      <w:lvlJc w:val="left"/>
+      <w:pPr>
+        <w:ind w:left="5607" w:hanging="360"/>
+      </w:pPr>
+    </w:lvl>
+    <w:lvl w:ilvl="7" w:tplc="04160019" w:tentative="1">
+      <w:start w:val="1"/>
+      <w:numFmt w:val="lowerLetter"/>
+      <w:lvlText w:val="%8."/>
+      <w:lvlJc w:val="left"/>
+      <w:pPr>
+        <w:ind w:left="6327" w:hanging="360"/>
+      </w:pPr>
+    </w:lvl>
+    <w:lvl w:ilvl="8" w:tplc="0416001B" w:tentative="1">
+      <w:start w:val="1"/>
+      <w:numFmt w:val="lowerRoman"/>
+      <w:lvlText w:val="%9."/>
+      <w:lvlJc w:val="right"/>
+      <w:pPr>
+        <w:ind w:left="7047" w:hanging="180"/>
+      </w:pPr>
+    </w:lvl>
+  </w:abstractNum>
+  <w:abstractNum w:abstractNumId="4">
+    <w:nsid w:val="2E5F362A"/>
+    <w:multiLevelType w:val="hybridMultilevel"/>
+    <w:tmpl w:val="AA368312"/>
+    <w:lvl w:ilvl="0" w:tplc="ACA81E9C">
+      <w:start w:val="1"/>
+      <w:numFmt w:val="lowerLetter"/>
+      <w:lvlText w:val="%1)"/>
+      <w:lvlJc w:val="left"/>
+      <w:pPr>
+        <w:ind w:left="927" w:hanging="360"/>
+      </w:pPr>
+      <w:rPr>
+        <w:rFonts w:hint="default"/>
+      </w:rPr>
+    </w:lvl>
+    <w:lvl w:ilvl="1" w:tplc="04160019" w:tentative="1">
+      <w:start w:val="1"/>
+      <w:numFmt w:val="lowerLetter"/>
+      <w:lvlText w:val="%2."/>
+      <w:lvlJc w:val="left"/>
+      <w:pPr>
+        <w:ind w:left="1647" w:hanging="360"/>
+      </w:pPr>
+    </w:lvl>
+    <w:lvl w:ilvl="2" w:tplc="0416001B" w:tentative="1">
+      <w:start w:val="1"/>
+      <w:numFmt w:val="lowerRoman"/>
+      <w:lvlText w:val="%3."/>
+      <w:lvlJc w:val="right"/>
+      <w:pPr>
+        <w:ind w:left="2367" w:hanging="180"/>
+      </w:pPr>
+    </w:lvl>
+    <w:lvl w:ilvl="3" w:tplc="0416000F" w:tentative="1">
+      <w:start w:val="1"/>
+      <w:numFmt w:val="decimal"/>
+      <w:lvlText w:val="%4."/>
+      <w:lvlJc w:val="left"/>
+      <w:pPr>
+        <w:ind w:left="3087" w:hanging="360"/>
+      </w:pPr>
+    </w:lvl>
+    <w:lvl w:ilvl="4" w:tplc="04160019" w:tentative="1">
+      <w:start w:val="1"/>
+      <w:numFmt w:val="lowerLetter"/>
+      <w:lvlText w:val="%5."/>
+      <w:lvlJc w:val="left"/>
+      <w:pPr>
+        <w:ind w:left="3807" w:hanging="360"/>
+      </w:pPr>
+    </w:lvl>
+    <w:lvl w:ilvl="5" w:tplc="0416001B" w:tentative="1">
+      <w:start w:val="1"/>
+      <w:numFmt w:val="lowerRoman"/>
+      <w:lvlText w:val="%6."/>
+      <w:lvlJc w:val="right"/>
+      <w:pPr>
+        <w:ind w:left="4527" w:hanging="180"/>
+      </w:pPr>
+    </w:lvl>
+    <w:lvl w:ilvl="6" w:tplc="0416000F" w:tentative="1">
+      <w:start w:val="1"/>
+      <w:numFmt w:val="decimal"/>
+      <w:lvlText w:val="%7."/>
+      <w:lvlJc w:val="left"/>
+      <w:pPr>
+        <w:ind w:left="5247" w:hanging="360"/>
+      </w:pPr>
+    </w:lvl>
+    <w:lvl w:ilvl="7" w:tplc="04160019" w:tentative="1">
+      <w:start w:val="1"/>
+      <w:numFmt w:val="lowerLetter"/>
+      <w:lvlText w:val="%8."/>
+      <w:lvlJc w:val="left"/>
+      <w:pPr>
+        <w:ind w:left="5967" w:hanging="360"/>
+      </w:pPr>
+    </w:lvl>
+    <w:lvl w:ilvl="8" w:tplc="0416001B" w:tentative="1">
+      <w:start w:val="1"/>
+      <w:numFmt w:val="lowerRoman"/>
+      <w:lvlText w:val="%9."/>
+      <w:lvlJc w:val="right"/>
+      <w:pPr>
+        <w:ind w:left="6687" w:hanging="180"/>
+      </w:pPr>
+    </w:lvl>
+  </w:abstractNum>
+  <w:abstractNum w:abstractNumId="5">
+    <w:nsid w:val="388D32EC"/>
+    <w:multiLevelType w:val="hybridMultilevel"/>
+    <w:tmpl w:val="8E9441B0"/>
+    <w:lvl w:ilvl="0" w:tplc="04160017">
+      <w:start w:val="1"/>
+      <w:numFmt w:val="lowerLetter"/>
+      <w:lvlText w:val="%1)"/>
+      <w:lvlJc w:val="left"/>
+      <w:pPr>
+        <w:ind w:left="1287" w:hanging="360"/>
+      </w:pPr>
+    </w:lvl>
+    <w:lvl w:ilvl="1" w:tplc="04160019" w:tentative="1">
+      <w:start w:val="1"/>
+      <w:numFmt w:val="lowerLetter"/>
+      <w:lvlText w:val="%2."/>
+      <w:lvlJc w:val="left"/>
+      <w:pPr>
+        <w:ind w:left="2007" w:hanging="360"/>
+      </w:pPr>
+    </w:lvl>
+    <w:lvl w:ilvl="2" w:tplc="0416001B" w:tentative="1">
+      <w:start w:val="1"/>
+      <w:numFmt w:val="lowerRoman"/>
+      <w:lvlText w:val="%3."/>
+      <w:lvlJc w:val="right"/>
+      <w:pPr>
+        <w:ind w:left="2727" w:hanging="180"/>
+      </w:pPr>
+    </w:lvl>
+    <w:lvl w:ilvl="3" w:tplc="0416000F" w:tentative="1">
+      <w:start w:val="1"/>
+      <w:numFmt w:val="decimal"/>
+      <w:lvlText w:val="%4."/>
+      <w:lvlJc w:val="left"/>
+      <w:pPr>
+        <w:ind w:left="3447" w:hanging="360"/>
+      </w:pPr>
+    </w:lvl>
+    <w:lvl w:ilvl="4" w:tplc="04160019" w:tentative="1">
+      <w:start w:val="1"/>
+      <w:numFmt w:val="lowerLetter"/>
+      <w:lvlText w:val="%5."/>
+      <w:lvlJc w:val="left"/>
+      <w:pPr>
+        <w:ind w:left="4167" w:hanging="360"/>
+      </w:pPr>
+    </w:lvl>
+    <w:lvl w:ilvl="5" w:tplc="0416001B" w:tentative="1">
+      <w:start w:val="1"/>
+      <w:numFmt w:val="lowerRoman"/>
+      <w:lvlText w:val="%6."/>
+      <w:lvlJc w:val="right"/>
+      <w:pPr>
+        <w:ind w:left="4887" w:hanging="180"/>
+      </w:pPr>
+    </w:lvl>
+    <w:lvl w:ilvl="6" w:tplc="0416000F" w:tentative="1">
+      <w:start w:val="1"/>
+      <w:numFmt w:val="decimal"/>
+      <w:lvlText w:val="%7."/>
+      <w:lvlJc w:val="left"/>
+      <w:pPr>
+        <w:ind w:left="5607" w:hanging="360"/>
+      </w:pPr>
+    </w:lvl>
+    <w:lvl w:ilvl="7" w:tplc="04160019" w:tentative="1">
+      <w:start w:val="1"/>
+      <w:numFmt w:val="lowerLetter"/>
+      <w:lvlText w:val="%8."/>
+      <w:lvlJc w:val="left"/>
+      <w:pPr>
+        <w:ind w:left="6327" w:hanging="360"/>
+      </w:pPr>
+    </w:lvl>
+    <w:lvl w:ilvl="8" w:tplc="0416001B" w:tentative="1">
+      <w:start w:val="1"/>
+      <w:numFmt w:val="lowerRoman"/>
+      <w:lvlText w:val="%9."/>
+      <w:lvlJc w:val="right"/>
+      <w:pPr>
+        <w:ind w:left="7047" w:hanging="180"/>
+      </w:pPr>
+    </w:lvl>
+  </w:abstractNum>
+  <w:abstractNum w:abstractNumId="6">
+    <w:nsid w:val="390242FD"/>
+    <w:multiLevelType w:val="hybridMultilevel"/>
+    <w:tmpl w:val="2F703360"/>
+    <w:lvl w:ilvl="0" w:tplc="0416000F">
+      <w:start w:val="1"/>
+      <w:numFmt w:val="decimal"/>
+      <w:lvlText w:val="%1."/>
+      <w:lvlJc w:val="left"/>
+      <w:pPr>
+        <w:ind w:left="1287" w:hanging="360"/>
+      </w:pPr>
+    </w:lvl>
+    <w:lvl w:ilvl="1" w:tplc="04160019" w:tentative="1">
+      <w:start w:val="1"/>
+      <w:numFmt w:val="lowerLetter"/>
+      <w:lvlText w:val="%2."/>
+      <w:lvlJc w:val="left"/>
+      <w:pPr>
+        <w:ind w:left="2007" w:hanging="360"/>
+      </w:pPr>
+    </w:lvl>
+    <w:lvl w:ilvl="2" w:tplc="0416001B" w:tentative="1">
+      <w:start w:val="1"/>
+      <w:numFmt w:val="lowerRoman"/>
+      <w:lvlText w:val="%3."/>
+      <w:lvlJc w:val="right"/>
+      <w:pPr>
+        <w:ind w:left="2727" w:hanging="180"/>
+      </w:pPr>
+    </w:lvl>
+    <w:lvl w:ilvl="3" w:tplc="0416000F" w:tentative="1">
+      <w:start w:val="1"/>
+      <w:numFmt w:val="decimal"/>
+      <w:lvlText w:val="%4."/>
+      <w:lvlJc w:val="left"/>
+      <w:pPr>
+        <w:ind w:left="3447" w:hanging="360"/>
+      </w:pPr>
+    </w:lvl>
+    <w:lvl w:ilvl="4" w:tplc="04160019" w:tentative="1">
+      <w:start w:val="1"/>
+      <w:numFmt w:val="lowerLetter"/>
+      <w:lvlText w:val="%5."/>
+      <w:lvlJc w:val="left"/>
+      <w:pPr>
+        <w:ind w:left="4167" w:hanging="360"/>
+      </w:pPr>
+    </w:lvl>
+    <w:lvl w:ilvl="5" w:tplc="0416001B" w:tentative="1">
+      <w:start w:val="1"/>
+      <w:numFmt w:val="lowerRoman"/>
+      <w:lvlText w:val="%6."/>
+      <w:lvlJc w:val="right"/>
+      <w:pPr>
+        <w:ind w:left="4887" w:hanging="180"/>
+      </w:pPr>
+    </w:lvl>
+    <w:lvl w:ilvl="6" w:tplc="0416000F" w:tentative="1">
+      <w:start w:val="1"/>
+      <w:numFmt w:val="decimal"/>
+      <w:lvlText w:val="%7."/>
+      <w:lvlJc w:val="left"/>
+      <w:pPr>
+        <w:ind w:left="5607" w:hanging="360"/>
+      </w:pPr>
+    </w:lvl>
+    <w:lvl w:ilvl="7" w:tplc="04160019" w:tentative="1">
+      <w:start w:val="1"/>
+      <w:numFmt w:val="lowerLetter"/>
+      <w:lvlText w:val="%8."/>
+      <w:lvlJc w:val="left"/>
+      <w:pPr>
+        <w:ind w:left="6327" w:hanging="360"/>
+      </w:pPr>
+    </w:lvl>
+    <w:lvl w:ilvl="8" w:tplc="0416001B" w:tentative="1">
+      <w:start w:val="1"/>
+      <w:numFmt w:val="lowerRoman"/>
+      <w:lvlText w:val="%9."/>
+      <w:lvlJc w:val="right"/>
+      <w:pPr>
+        <w:ind w:left="7047" w:hanging="180"/>
+      </w:pPr>
+    </w:lvl>
+  </w:abstractNum>
+  <w:abstractNum w:abstractNumId="7">
+    <w:nsid w:val="4D7078F7"/>
+    <w:multiLevelType w:val="multilevel"/>
+    <w:tmpl w:val="EC3EB70E"/>
+    <w:lvl w:ilvl="0">
+      <w:start w:val="1"/>
+      <w:numFmt w:val="bullet"/>
+      <w:lvlText w:val=""/>
+      <w:lvlJc w:val="left"/>
+      <w:pPr>
+        <w:tabs>
+          <w:tab w:val="num" w:pos="720"/>
+        </w:tabs>
+        <w:ind w:left="720" w:hanging="360"/>
+      </w:pPr>
+      <w:rPr>
+        <w:rFonts w:ascii="Symbol" w:hAnsi="Symbol" w:hint="default"/>
+        <w:sz w:val="20"/>
+      </w:rPr>
+    </w:lvl>
     <w:lvl w:ilvl="1" w:tentative="1">
       <w:start w:val="1"/>
       <w:numFmt w:val="bullet"/>
@@ -7243,10 +7438,10 @@
       </w:rPr>
     </w:lvl>
   </w:abstractNum>
-  <w:abstractNum w:abstractNumId="3">
-    <w:nsid w:val="4D7078F7"/>
+  <w:abstractNum w:abstractNumId="8">
+    <w:nsid w:val="55394156"/>
     <w:multiLevelType w:val="multilevel"/>
-    <w:tmpl w:val="EC3EB70E"/>
+    <w:tmpl w:val="7F28A0DC"/>
     <w:lvl w:ilvl="0">
       <w:start w:val="1"/>
       <w:numFmt w:val="bullet"/>
@@ -7392,10 +7587,268 @@
       </w:rPr>
     </w:lvl>
   </w:abstractNum>
-  <w:abstractNum w:abstractNumId="4">
-    <w:nsid w:val="55394156"/>
+  <w:abstractNum w:abstractNumId="9">
+    <w:nsid w:val="57D84AAC"/>
+    <w:multiLevelType w:val="hybridMultilevel"/>
+    <w:tmpl w:val="FC04CF50"/>
+    <w:lvl w:ilvl="0" w:tplc="04160017">
+      <w:start w:val="1"/>
+      <w:numFmt w:val="lowerLetter"/>
+      <w:lvlText w:val="%1)"/>
+      <w:lvlJc w:val="left"/>
+      <w:pPr>
+        <w:ind w:left="1287" w:hanging="360"/>
+      </w:pPr>
+    </w:lvl>
+    <w:lvl w:ilvl="1" w:tplc="04160019" w:tentative="1">
+      <w:start w:val="1"/>
+      <w:numFmt w:val="lowerLetter"/>
+      <w:lvlText w:val="%2."/>
+      <w:lvlJc w:val="left"/>
+      <w:pPr>
+        <w:ind w:left="2007" w:hanging="360"/>
+      </w:pPr>
+    </w:lvl>
+    <w:lvl w:ilvl="2" w:tplc="0416001B" w:tentative="1">
+      <w:start w:val="1"/>
+      <w:numFmt w:val="lowerRoman"/>
+      <w:lvlText w:val="%3."/>
+      <w:lvlJc w:val="right"/>
+      <w:pPr>
+        <w:ind w:left="2727" w:hanging="180"/>
+      </w:pPr>
+    </w:lvl>
+    <w:lvl w:ilvl="3" w:tplc="0416000F" w:tentative="1">
+      <w:start w:val="1"/>
+      <w:numFmt w:val="decimal"/>
+      <w:lvlText w:val="%4."/>
+      <w:lvlJc w:val="left"/>
+      <w:pPr>
+        <w:ind w:left="3447" w:hanging="360"/>
+      </w:pPr>
+    </w:lvl>
+    <w:lvl w:ilvl="4" w:tplc="04160019" w:tentative="1">
+      <w:start w:val="1"/>
+      <w:numFmt w:val="lowerLetter"/>
+      <w:lvlText w:val="%5."/>
+      <w:lvlJc w:val="left"/>
+      <w:pPr>
+        <w:ind w:left="4167" w:hanging="360"/>
+      </w:pPr>
+    </w:lvl>
+    <w:lvl w:ilvl="5" w:tplc="0416001B" w:tentative="1">
+      <w:start w:val="1"/>
+      <w:numFmt w:val="lowerRoman"/>
+      <w:lvlText w:val="%6."/>
+      <w:lvlJc w:val="right"/>
+      <w:pPr>
+        <w:ind w:left="4887" w:hanging="180"/>
+      </w:pPr>
+    </w:lvl>
+    <w:lvl w:ilvl="6" w:tplc="0416000F" w:tentative="1">
+      <w:start w:val="1"/>
+      <w:numFmt w:val="decimal"/>
+      <w:lvlText w:val="%7."/>
+      <w:lvlJc w:val="left"/>
+      <w:pPr>
+        <w:ind w:left="5607" w:hanging="360"/>
+      </w:pPr>
+    </w:lvl>
+    <w:lvl w:ilvl="7" w:tplc="04160019" w:tentative="1">
+      <w:start w:val="1"/>
+      <w:numFmt w:val="lowerLetter"/>
+      <w:lvlText w:val="%8."/>
+      <w:lvlJc w:val="left"/>
+      <w:pPr>
+        <w:ind w:left="6327" w:hanging="360"/>
+      </w:pPr>
+    </w:lvl>
+    <w:lvl w:ilvl="8" w:tplc="0416001B" w:tentative="1">
+      <w:start w:val="1"/>
+      <w:numFmt w:val="lowerRoman"/>
+      <w:lvlText w:val="%9."/>
+      <w:lvlJc w:val="right"/>
+      <w:pPr>
+        <w:ind w:left="7047" w:hanging="180"/>
+      </w:pPr>
+    </w:lvl>
+  </w:abstractNum>
+  <w:abstractNum w:abstractNumId="10">
+    <w:nsid w:val="699842BF"/>
+    <w:multiLevelType w:val="hybridMultilevel"/>
+    <w:tmpl w:val="C2F0E7E0"/>
+    <w:lvl w:ilvl="0" w:tplc="04160017">
+      <w:start w:val="1"/>
+      <w:numFmt w:val="lowerLetter"/>
+      <w:lvlText w:val="%1)"/>
+      <w:lvlJc w:val="left"/>
+      <w:pPr>
+        <w:ind w:left="1287" w:hanging="360"/>
+      </w:pPr>
+    </w:lvl>
+    <w:lvl w:ilvl="1" w:tplc="04160019" w:tentative="1">
+      <w:start w:val="1"/>
+      <w:numFmt w:val="lowerLetter"/>
+      <w:lvlText w:val="%2."/>
+      <w:lvlJc w:val="left"/>
+      <w:pPr>
+        <w:ind w:left="2007" w:hanging="360"/>
+      </w:pPr>
+    </w:lvl>
+    <w:lvl w:ilvl="2" w:tplc="0416001B" w:tentative="1">
+      <w:start w:val="1"/>
+      <w:numFmt w:val="lowerRoman"/>
+      <w:lvlText w:val="%3."/>
+      <w:lvlJc w:val="right"/>
+      <w:pPr>
+        <w:ind w:left="2727" w:hanging="180"/>
+      </w:pPr>
+    </w:lvl>
+    <w:lvl w:ilvl="3" w:tplc="0416000F" w:tentative="1">
+      <w:start w:val="1"/>
+      <w:numFmt w:val="decimal"/>
+      <w:lvlText w:val="%4."/>
+      <w:lvlJc w:val="left"/>
+      <w:pPr>
+        <w:ind w:left="3447" w:hanging="360"/>
+      </w:pPr>
+    </w:lvl>
+    <w:lvl w:ilvl="4" w:tplc="04160019" w:tentative="1">
+      <w:start w:val="1"/>
+      <w:numFmt w:val="lowerLetter"/>
+      <w:lvlText w:val="%5."/>
+      <w:lvlJc w:val="left"/>
+      <w:pPr>
+        <w:ind w:left="4167" w:hanging="360"/>
+      </w:pPr>
+    </w:lvl>
+    <w:lvl w:ilvl="5" w:tplc="0416001B" w:tentative="1">
+      <w:start w:val="1"/>
+      <w:numFmt w:val="lowerRoman"/>
+      <w:lvlText w:val="%6."/>
+      <w:lvlJc w:val="right"/>
+      <w:pPr>
+        <w:ind w:left="4887" w:hanging="180"/>
+      </w:pPr>
+    </w:lvl>
+    <w:lvl w:ilvl="6" w:tplc="0416000F" w:tentative="1">
+      <w:start w:val="1"/>
+      <w:numFmt w:val="decimal"/>
+      <w:lvlText w:val="%7."/>
+      <w:lvlJc w:val="left"/>
+      <w:pPr>
+        <w:ind w:left="5607" w:hanging="360"/>
+      </w:pPr>
+    </w:lvl>
+    <w:lvl w:ilvl="7" w:tplc="04160019" w:tentative="1">
+      <w:start w:val="1"/>
+      <w:numFmt w:val="lowerLetter"/>
+      <w:lvlText w:val="%8."/>
+      <w:lvlJc w:val="left"/>
+      <w:pPr>
+        <w:ind w:left="6327" w:hanging="360"/>
+      </w:pPr>
+    </w:lvl>
+    <w:lvl w:ilvl="8" w:tplc="0416001B" w:tentative="1">
+      <w:start w:val="1"/>
+      <w:numFmt w:val="lowerRoman"/>
+      <w:lvlText w:val="%9."/>
+      <w:lvlJc w:val="right"/>
+      <w:pPr>
+        <w:ind w:left="7047" w:hanging="180"/>
+      </w:pPr>
+    </w:lvl>
+  </w:abstractNum>
+  <w:abstractNum w:abstractNumId="11">
+    <w:nsid w:val="6D2D2C5F"/>
+    <w:multiLevelType w:val="hybridMultilevel"/>
+    <w:tmpl w:val="FF4CCD2C"/>
+    <w:lvl w:ilvl="0" w:tplc="04160017">
+      <w:start w:val="1"/>
+      <w:numFmt w:val="lowerLetter"/>
+      <w:lvlText w:val="%1)"/>
+      <w:lvlJc w:val="left"/>
+      <w:pPr>
+        <w:ind w:left="1287" w:hanging="360"/>
+      </w:pPr>
+    </w:lvl>
+    <w:lvl w:ilvl="1" w:tplc="04160019" w:tentative="1">
+      <w:start w:val="1"/>
+      <w:numFmt w:val="lowerLetter"/>
+      <w:lvlText w:val="%2."/>
+      <w:lvlJc w:val="left"/>
+      <w:pPr>
+        <w:ind w:left="2007" w:hanging="360"/>
+      </w:pPr>
+    </w:lvl>
+    <w:lvl w:ilvl="2" w:tplc="0416001B" w:tentative="1">
+      <w:start w:val="1"/>
+      <w:numFmt w:val="lowerRoman"/>
+      <w:lvlText w:val="%3."/>
+      <w:lvlJc w:val="right"/>
+      <w:pPr>
+        <w:ind w:left="2727" w:hanging="180"/>
+      </w:pPr>
+    </w:lvl>
+    <w:lvl w:ilvl="3" w:tplc="0416000F" w:tentative="1">
+      <w:start w:val="1"/>
+      <w:numFmt w:val="decimal"/>
+      <w:lvlText w:val="%4."/>
+      <w:lvlJc w:val="left"/>
+      <w:pPr>
+        <w:ind w:left="3447" w:hanging="360"/>
+      </w:pPr>
+    </w:lvl>
+    <w:lvl w:ilvl="4" w:tplc="04160019" w:tentative="1">
+      <w:start w:val="1"/>
+      <w:numFmt w:val="lowerLetter"/>
+      <w:lvlText w:val="%5."/>
+      <w:lvlJc w:val="left"/>
+      <w:pPr>
+        <w:ind w:left="4167" w:hanging="360"/>
+      </w:pPr>
+    </w:lvl>
+    <w:lvl w:ilvl="5" w:tplc="0416001B" w:tentative="1">
+      <w:start w:val="1"/>
+      <w:numFmt w:val="lowerRoman"/>
+      <w:lvlText w:val="%6."/>
+      <w:lvlJc w:val="right"/>
+      <w:pPr>
+        <w:ind w:left="4887" w:hanging="180"/>
+      </w:pPr>
+    </w:lvl>
+    <w:lvl w:ilvl="6" w:tplc="0416000F" w:tentative="1">
+      <w:start w:val="1"/>
+      <w:numFmt w:val="decimal"/>
+      <w:lvlText w:val="%7."/>
+      <w:lvlJc w:val="left"/>
+      <w:pPr>
+        <w:ind w:left="5607" w:hanging="360"/>
+      </w:pPr>
+    </w:lvl>
+    <w:lvl w:ilvl="7" w:tplc="04160019" w:tentative="1">
+      <w:start w:val="1"/>
+      <w:numFmt w:val="lowerLetter"/>
+      <w:lvlText w:val="%8."/>
+      <w:lvlJc w:val="left"/>
+      <w:pPr>
+        <w:ind w:left="6327" w:hanging="360"/>
+      </w:pPr>
+    </w:lvl>
+    <w:lvl w:ilvl="8" w:tplc="0416001B" w:tentative="1">
+      <w:start w:val="1"/>
+      <w:numFmt w:val="lowerRoman"/>
+      <w:lvlText w:val="%9."/>
+      <w:lvlJc w:val="right"/>
+      <w:pPr>
+        <w:ind w:left="7047" w:hanging="180"/>
+      </w:pPr>
+    </w:lvl>
+  </w:abstractNum>
+  <w:abstractNum w:abstractNumId="12">
+    <w:nsid w:val="73B83060"/>
     <w:multiLevelType w:val="multilevel"/>
-    <w:tmpl w:val="7F28A0DC"/>
+    <w:tmpl w:val="19567164"/>
     <w:lvl w:ilvl="0">
       <w:start w:val="1"/>
       <w:numFmt w:val="bullet"/>
@@ -7541,156 +7994,93 @@
       </w:rPr>
     </w:lvl>
   </w:abstractNum>
-  <w:abstractNum w:abstractNumId="5">
-    <w:nsid w:val="73B83060"/>
-    <w:multiLevelType w:val="multilevel"/>
-    <w:tmpl w:val="19567164"/>
-    <w:lvl w:ilvl="0">
-      <w:start w:val="1"/>
-      <w:numFmt w:val="bullet"/>
-      <w:lvlText w:val=""/>
-      <w:lvlJc w:val="left"/>
-      <w:pPr>
-        <w:tabs>
-          <w:tab w:val="num" w:pos="720"/>
-        </w:tabs>
-        <w:ind w:left="720" w:hanging="360"/>
-      </w:pPr>
-      <w:rPr>
-        <w:rFonts w:ascii="Symbol" w:hAnsi="Symbol" w:hint="default"/>
-        <w:sz w:val="20"/>
-      </w:rPr>
-    </w:lvl>
-    <w:lvl w:ilvl="1" w:tentative="1">
-      <w:start w:val="1"/>
-      <w:numFmt w:val="bullet"/>
-      <w:lvlText w:val="o"/>
-      <w:lvlJc w:val="left"/>
-      <w:pPr>
-        <w:tabs>
-          <w:tab w:val="num" w:pos="1440"/>
-        </w:tabs>
-        <w:ind w:left="1440" w:hanging="360"/>
-      </w:pPr>
-      <w:rPr>
-        <w:rFonts w:ascii="Courier New" w:hAnsi="Courier New" w:hint="default"/>
-        <w:sz w:val="20"/>
-      </w:rPr>
-    </w:lvl>
-    <w:lvl w:ilvl="2" w:tentative="1">
-      <w:start w:val="1"/>
-      <w:numFmt w:val="bullet"/>
-      <w:lvlText w:val=""/>
-      <w:lvlJc w:val="left"/>
-      <w:pPr>
-        <w:tabs>
-          <w:tab w:val="num" w:pos="2160"/>
-        </w:tabs>
-        <w:ind w:left="2160" w:hanging="360"/>
-      </w:pPr>
-      <w:rPr>
-        <w:rFonts w:ascii="Wingdings" w:hAnsi="Wingdings" w:hint="default"/>
-        <w:sz w:val="20"/>
-      </w:rPr>
-    </w:lvl>
-    <w:lvl w:ilvl="3" w:tentative="1">
-      <w:start w:val="1"/>
-      <w:numFmt w:val="bullet"/>
-      <w:lvlText w:val=""/>
-      <w:lvlJc w:val="left"/>
-      <w:pPr>
-        <w:tabs>
-          <w:tab w:val="num" w:pos="2880"/>
-        </w:tabs>
-        <w:ind w:left="2880" w:hanging="360"/>
-      </w:pPr>
-      <w:rPr>
-        <w:rFonts w:ascii="Wingdings" w:hAnsi="Wingdings" w:hint="default"/>
-        <w:sz w:val="20"/>
-      </w:rPr>
-    </w:lvl>
-    <w:lvl w:ilvl="4" w:tentative="1">
-      <w:start w:val="1"/>
-      <w:numFmt w:val="bullet"/>
-      <w:lvlText w:val=""/>
-      <w:lvlJc w:val="left"/>
-      <w:pPr>
-        <w:tabs>
-          <w:tab w:val="num" w:pos="3600"/>
-        </w:tabs>
-        <w:ind w:left="3600" w:hanging="360"/>
-      </w:pPr>
-      <w:rPr>
-        <w:rFonts w:ascii="Wingdings" w:hAnsi="Wingdings" w:hint="default"/>
-        <w:sz w:val="20"/>
-      </w:rPr>
-    </w:lvl>
-    <w:lvl w:ilvl="5" w:tentative="1">
-      <w:start w:val="1"/>
-      <w:numFmt w:val="bullet"/>
-      <w:lvlText w:val=""/>
-      <w:lvlJc w:val="left"/>
-      <w:pPr>
-        <w:tabs>
-          <w:tab w:val="num" w:pos="4320"/>
-        </w:tabs>
-        <w:ind w:left="4320" w:hanging="360"/>
-      </w:pPr>
-      <w:rPr>
-        <w:rFonts w:ascii="Wingdings" w:hAnsi="Wingdings" w:hint="default"/>
-        <w:sz w:val="20"/>
-      </w:rPr>
-    </w:lvl>
-    <w:lvl w:ilvl="6" w:tentative="1">
-      <w:start w:val="1"/>
-      <w:numFmt w:val="bullet"/>
-      <w:lvlText w:val=""/>
-      <w:lvlJc w:val="left"/>
-      <w:pPr>
-        <w:tabs>
-          <w:tab w:val="num" w:pos="5040"/>
-        </w:tabs>
-        <w:ind w:left="5040" w:hanging="360"/>
-      </w:pPr>
-      <w:rPr>
-        <w:rFonts w:ascii="Wingdings" w:hAnsi="Wingdings" w:hint="default"/>
-        <w:sz w:val="20"/>
-      </w:rPr>
-    </w:lvl>
-    <w:lvl w:ilvl="7" w:tentative="1">
-      <w:start w:val="1"/>
-      <w:numFmt w:val="bullet"/>
-      <w:lvlText w:val=""/>
-      <w:lvlJc w:val="left"/>
-      <w:pPr>
-        <w:tabs>
-          <w:tab w:val="num" w:pos="5760"/>
-        </w:tabs>
-        <w:ind w:left="5760" w:hanging="360"/>
-      </w:pPr>
-      <w:rPr>
-        <w:rFonts w:ascii="Wingdings" w:hAnsi="Wingdings" w:hint="default"/>
-        <w:sz w:val="20"/>
-      </w:rPr>
-    </w:lvl>
-    <w:lvl w:ilvl="8" w:tentative="1">
-      <w:start w:val="1"/>
-      <w:numFmt w:val="bullet"/>
-      <w:lvlText w:val=""/>
-      <w:lvlJc w:val="left"/>
-      <w:pPr>
-        <w:tabs>
-          <w:tab w:val="num" w:pos="6480"/>
-        </w:tabs>
-        <w:ind w:left="6480" w:hanging="360"/>
-      </w:pPr>
-      <w:rPr>
-        <w:rFonts w:ascii="Wingdings" w:hAnsi="Wingdings" w:hint="default"/>
-        <w:sz w:val="20"/>
-      </w:rPr>
+  <w:abstractNum w:abstractNumId="13">
+    <w:nsid w:val="76F8493B"/>
+    <w:multiLevelType w:val="hybridMultilevel"/>
+    <w:tmpl w:val="4C3041D0"/>
+    <w:lvl w:ilvl="0" w:tplc="0416000F">
+      <w:start w:val="1"/>
+      <w:numFmt w:val="decimal"/>
+      <w:lvlText w:val="%1."/>
+      <w:lvlJc w:val="left"/>
+      <w:pPr>
+        <w:ind w:left="1287" w:hanging="360"/>
+      </w:pPr>
+    </w:lvl>
+    <w:lvl w:ilvl="1" w:tplc="04160019" w:tentative="1">
+      <w:start w:val="1"/>
+      <w:numFmt w:val="lowerLetter"/>
+      <w:lvlText w:val="%2."/>
+      <w:lvlJc w:val="left"/>
+      <w:pPr>
+        <w:ind w:left="2007" w:hanging="360"/>
+      </w:pPr>
+    </w:lvl>
+    <w:lvl w:ilvl="2" w:tplc="0416001B" w:tentative="1">
+      <w:start w:val="1"/>
+      <w:numFmt w:val="lowerRoman"/>
+      <w:lvlText w:val="%3."/>
+      <w:lvlJc w:val="right"/>
+      <w:pPr>
+        <w:ind w:left="2727" w:hanging="180"/>
+      </w:pPr>
+    </w:lvl>
+    <w:lvl w:ilvl="3" w:tplc="0416000F" w:tentative="1">
+      <w:start w:val="1"/>
+      <w:numFmt w:val="decimal"/>
+      <w:lvlText w:val="%4."/>
+      <w:lvlJc w:val="left"/>
+      <w:pPr>
+        <w:ind w:left="3447" w:hanging="360"/>
+      </w:pPr>
+    </w:lvl>
+    <w:lvl w:ilvl="4" w:tplc="04160019" w:tentative="1">
+      <w:start w:val="1"/>
+      <w:numFmt w:val="lowerLetter"/>
+      <w:lvlText w:val="%5."/>
+      <w:lvlJc w:val="left"/>
+      <w:pPr>
+        <w:ind w:left="4167" w:hanging="360"/>
+      </w:pPr>
+    </w:lvl>
+    <w:lvl w:ilvl="5" w:tplc="0416001B" w:tentative="1">
+      <w:start w:val="1"/>
+      <w:numFmt w:val="lowerRoman"/>
+      <w:lvlText w:val="%6."/>
+      <w:lvlJc w:val="right"/>
+      <w:pPr>
+        <w:ind w:left="4887" w:hanging="180"/>
+      </w:pPr>
+    </w:lvl>
+    <w:lvl w:ilvl="6" w:tplc="0416000F" w:tentative="1">
+      <w:start w:val="1"/>
+      <w:numFmt w:val="decimal"/>
+      <w:lvlText w:val="%7."/>
+      <w:lvlJc w:val="left"/>
+      <w:pPr>
+        <w:ind w:left="5607" w:hanging="360"/>
+      </w:pPr>
+    </w:lvl>
+    <w:lvl w:ilvl="7" w:tplc="04160019" w:tentative="1">
+      <w:start w:val="1"/>
+      <w:numFmt w:val="lowerLetter"/>
+      <w:lvlText w:val="%8."/>
+      <w:lvlJc w:val="left"/>
+      <w:pPr>
+        <w:ind w:left="6327" w:hanging="360"/>
+      </w:pPr>
+    </w:lvl>
+    <w:lvl w:ilvl="8" w:tplc="0416001B" w:tentative="1">
+      <w:start w:val="1"/>
+      <w:numFmt w:val="lowerRoman"/>
+      <w:lvlText w:val="%9."/>
+      <w:lvlJc w:val="right"/>
+      <w:pPr>
+        <w:ind w:left="7047" w:hanging="180"/>
+      </w:pPr>
     </w:lvl>
   </w:abstractNum>
-  <w:abstractNum w:abstractNumId="6">
+  <w:abstractNum w:abstractNumId="14">
     <w:nsid w:val="7E740163"/>
     <w:multiLevelType w:val="multilevel"/>
     <w:tmpl w:val="A740C9EA"/>
@@ -7843,22 +8233,46 @@
     <w:abstractNumId w:val="2"/>
   </w:num>
   <w:num w:numId="2">
-    <w:abstractNumId w:val="4"/>
+    <w:abstractNumId w:val="8"/>
   </w:num>
   <w:num w:numId="3">
-    <w:abstractNumId w:val="5"/>
+    <w:abstractNumId w:val="12"/>
   </w:num>
   <w:num w:numId="4">
     <w:abstractNumId w:val="1"/>
   </w:num>
   <w:num w:numId="5">
-    <w:abstractNumId w:val="6"/>
+    <w:abstractNumId w:val="14"/>
   </w:num>
   <w:num w:numId="6">
     <w:abstractNumId w:val="0"/>
   </w:num>
   <w:num w:numId="7">
+    <w:abstractNumId w:val="7"/>
+  </w:num>
+  <w:num w:numId="8">
+    <w:abstractNumId w:val="4"/>
+  </w:num>
+  <w:num w:numId="9">
+    <w:abstractNumId w:val="10"/>
+  </w:num>
+  <w:num w:numId="10">
+    <w:abstractNumId w:val="13"/>
+  </w:num>
+  <w:num w:numId="11">
+    <w:abstractNumId w:val="11"/>
+  </w:num>
+  <w:num w:numId="12">
+    <w:abstractNumId w:val="5"/>
+  </w:num>
+  <w:num w:numId="13">
+    <w:abstractNumId w:val="6"/>
+  </w:num>
+  <w:num w:numId="14">
     <w:abstractNumId w:val="3"/>
+  </w:num>
+  <w:num w:numId="15">
+    <w:abstractNumId w:val="9"/>
   </w:num>
 </w:numbering>
 </file>
@@ -8284,7 +8698,6 @@
     <w:next w:val="Normal"/>
     <w:link w:val="Ttulo2Char"/>
     <w:uiPriority w:val="9"/>
-    <w:semiHidden/>
     <w:unhideWhenUsed/>
     <w:qFormat/>
     <w:rsid w:val="00F67776"/>
@@ -8497,7 +8910,6 @@
     <w:basedOn w:val="Fontepargpadro"/>
     <w:link w:val="Ttulo2"/>
     <w:uiPriority w:val="9"/>
-    <w:semiHidden/>
     <w:rsid w:val="00F67776"/>
     <w:rPr>
       <w:rFonts w:asciiTheme="majorHAnsi" w:eastAsiaTheme="majorEastAsia" w:hAnsiTheme="majorHAnsi" w:cstheme="majorBidi"/>
@@ -8786,7 +9198,7 @@
 </file>
 
 <file path=customXml/itemProps1.xml><?xml version="1.0" encoding="utf-8"?>
-<ds:datastoreItem xmlns:ds="http://schemas.openxmlformats.org/officeDocument/2006/customXml" ds:itemID="{E0DBE384-BB5F-439A-B6DD-6C8327C4C48A}">
+<ds:datastoreItem xmlns:ds="http://schemas.openxmlformats.org/officeDocument/2006/customXml" ds:itemID="{7191FAD7-BE34-467A-8949-35A0798CAFB1}">
   <ds:schemaRefs>
     <ds:schemaRef ds:uri="http://schemas.openxmlformats.org/officeDocument/2006/bibliography"/>
   </ds:schemaRefs>

</xml_diff>

<commit_message>
Update PROJECTO CNECTA LUREFRAMULO.docx
</commit_message>
<xml_diff>
--- a/ARQUIVOS LURE_PRECI/PROJECTO CNECTA LUREFRAMULO.docx
+++ b/ARQUIVOS LURE_PRECI/PROJECTO CNECTA LUREFRAMULO.docx
@@ -3925,27 +3925,6 @@
     </w:p>
     <w:p>
       <w:pPr>
-        <w:spacing w:line="360" w:lineRule="auto"/>
-        <w:jc w:val="both"/>
-        <w:rPr>
-          <w:rFonts w:ascii="Times New Roman" w:eastAsia="Times New Roman" w:hAnsi="Times New Roman" w:cs="Times New Roman"/>
-          <w:sz w:val="24"/>
-          <w:szCs w:val="24"/>
-          <w:lang w:eastAsia="pt-BR"/>
-        </w:rPr>
-      </w:pPr>
-      <w:r>
-        <w:rPr>
-          <w:rFonts w:ascii="Times New Roman" w:eastAsia="Times New Roman" w:hAnsi="Times New Roman" w:cs="Times New Roman"/>
-          <w:sz w:val="24"/>
-          <w:szCs w:val="24"/>
-          <w:lang w:eastAsia="pt-BR"/>
-        </w:rPr>
-        <w:br w:type="page"/>
-      </w:r>
-    </w:p>
-    <w:p>
-      <w:pPr>
         <w:pStyle w:val="Ttulo1"/>
         <w:tabs>
           <w:tab w:val="left" w:pos="5554"/>
@@ -3962,8 +3941,7 @@
           <w:sz w:val="24"/>
           <w:szCs w:val="24"/>
         </w:rPr>
-        <w:lastRenderedPageBreak/>
-        <w:t>9. TECNOLOGIAS UTILIZADAS (EM LINGUAGEM ACESSÍVEL)</w:t>
+        <w:t>9. TECNOLOGIAS UTILIZADAS</w:t>
       </w:r>
       <w:r>
         <w:rPr>
@@ -3986,168 +3964,232 @@
           <w:lang w:eastAsia="pt-BR"/>
         </w:rPr>
       </w:pPr>
+      <w:r>
+        <w:rPr>
+          <w:rFonts w:ascii="Times New Roman" w:hAnsi="Times New Roman" w:cs="Times New Roman"/>
+          <w:i/>
+          <w:sz w:val="24"/>
+          <w:szCs w:val="24"/>
+        </w:rPr>
+        <w:t>"A tecnologia só gera valor quando é compreendida por quem toma decisões."</w:t>
+      </w:r>
+    </w:p>
+    <w:p>
+      <w:pPr>
+        <w:pStyle w:val="NormalWeb"/>
+        <w:spacing w:line="360" w:lineRule="auto"/>
+        <w:ind w:firstLine="567"/>
+        <w:jc w:val="both"/>
+      </w:pPr>
+      <w:r>
+        <w:t>O Projeto Conecta Lureframulu &amp; Precimuel será desenvolvido com recurso a tecnologias amplamente utilizadas na criação de plataformas institucionais em todo o mundo. A escolha dessas tecnologias não foi feita por serem as mais complexas, mas por reunirem características importantes para o Instituto: estabilidade, facilidade de manutenção, segurança, desempenho e possibilidade de evolução.</w:t>
+      </w:r>
+    </w:p>
+    <w:p>
+      <w:pPr>
+        <w:pStyle w:val="NormalWeb"/>
+        <w:spacing w:line="360" w:lineRule="auto"/>
+        <w:ind w:firstLine="567"/>
+        <w:jc w:val="both"/>
+      </w:pPr>
+      <w:r>
+        <w:lastRenderedPageBreak/>
+        <w:t>A seguir, apresenta-se uma explicação simples sobre o papel de cada tecnologia na construção da plataforma.</w:t>
+      </w:r>
+    </w:p>
+    <w:p>
+      <w:pPr>
+        <w:pStyle w:val="Ttulo2"/>
+        <w:spacing w:line="360" w:lineRule="auto"/>
+        <w:ind w:firstLine="567"/>
+        <w:jc w:val="both"/>
+        <w:rPr>
+          <w:rFonts w:ascii="Times New Roman" w:hAnsi="Times New Roman" w:cs="Times New Roman"/>
+          <w:color w:val="auto"/>
+          <w:sz w:val="24"/>
+          <w:szCs w:val="24"/>
+        </w:rPr>
+      </w:pPr>
+      <w:r>
+        <w:rPr>
+          <w:rFonts w:ascii="Times New Roman" w:hAnsi="Times New Roman" w:cs="Times New Roman"/>
+          <w:color w:val="auto"/>
+          <w:sz w:val="24"/>
+          <w:szCs w:val="24"/>
+        </w:rPr>
+        <w:t>HTML – A estrutura da plataforma</w:t>
+      </w:r>
+    </w:p>
+    <w:p>
+      <w:pPr>
+        <w:pStyle w:val="NormalWeb"/>
+        <w:spacing w:line="360" w:lineRule="auto"/>
+        <w:ind w:firstLine="567"/>
+        <w:jc w:val="both"/>
+      </w:pPr>
+      <w:r>
+        <w:t>O HTML pode ser comparado à estrutura de um edifício. É a tecnologia responsável por organizar todas as informações apresentadas na plataforma, definindo onde serão exibidos os textos, imagens, menus, formulários e demais conteúdos.</w:t>
+      </w:r>
+    </w:p>
+    <w:p>
+      <w:pPr>
+        <w:pStyle w:val="NormalWeb"/>
+        <w:spacing w:line="360" w:lineRule="auto"/>
+        <w:ind w:firstLine="567"/>
+        <w:jc w:val="both"/>
+      </w:pPr>
+      <w:r>
+        <w:t>Graças ao HTML, cada informação possui um local próprio e organizado, permitindo que os visitantes encontrem facilmente aquilo que procuram.</w:t>
+      </w:r>
+    </w:p>
+    <w:p>
+      <w:pPr>
+        <w:pStyle w:val="Ttulo2"/>
+        <w:spacing w:line="360" w:lineRule="auto"/>
+        <w:ind w:firstLine="567"/>
+        <w:jc w:val="both"/>
+        <w:rPr>
+          <w:rFonts w:ascii="Times New Roman" w:hAnsi="Times New Roman" w:cs="Times New Roman"/>
+          <w:color w:val="auto"/>
+          <w:sz w:val="24"/>
+          <w:szCs w:val="24"/>
+        </w:rPr>
+      </w:pPr>
+      <w:r>
+        <w:rPr>
+          <w:rFonts w:ascii="Times New Roman" w:hAnsi="Times New Roman" w:cs="Times New Roman"/>
+          <w:color w:val="auto"/>
+          <w:sz w:val="24"/>
+          <w:szCs w:val="24"/>
+        </w:rPr>
+        <w:t>CSS – A identidade visual</w:t>
+      </w:r>
+    </w:p>
+    <w:p>
+      <w:pPr>
+        <w:pStyle w:val="NormalWeb"/>
+        <w:spacing w:line="360" w:lineRule="auto"/>
+        <w:ind w:firstLine="567"/>
+        <w:jc w:val="both"/>
+      </w:pPr>
+      <w:r>
+        <w:t>O CSS é responsável pela aparência da plataforma.</w:t>
+      </w:r>
+    </w:p>
+    <w:p>
+      <w:pPr>
+        <w:pStyle w:val="NormalWeb"/>
+        <w:spacing w:line="360" w:lineRule="auto"/>
+        <w:ind w:firstLine="567"/>
+        <w:jc w:val="both"/>
+      </w:pPr>
+      <w:r>
+        <w:t>É através desta tecnologia que são definidos os elementos visuais, como cores, tipos de letra, espaçamentos, organização das páginas e adaptação a diferentes tamanhos de ecrã, incluindo computadores, tablets e telemóveis.</w:t>
+      </w:r>
+    </w:p>
+    <w:p>
+      <w:pPr>
+        <w:pStyle w:val="NormalWeb"/>
+        <w:spacing w:line="360" w:lineRule="auto"/>
+        <w:ind w:firstLine="567"/>
+        <w:jc w:val="both"/>
+      </w:pPr>
+      <w:r>
+        <w:t>Em termos simples, enquanto o HTML constrói a estrutura, o CSS torna essa estrutura agradável, organizada e compatível com a identidade visual do Instituto.</w:t>
+      </w:r>
+    </w:p>
+    <w:p>
+      <w:pPr>
+        <w:pStyle w:val="Ttulo2"/>
+        <w:spacing w:line="360" w:lineRule="auto"/>
+        <w:ind w:firstLine="567"/>
+        <w:jc w:val="both"/>
+        <w:rPr>
+          <w:rFonts w:ascii="Times New Roman" w:hAnsi="Times New Roman" w:cs="Times New Roman"/>
+          <w:color w:val="auto"/>
+          <w:sz w:val="24"/>
+          <w:szCs w:val="24"/>
+        </w:rPr>
+      </w:pPr>
+      <w:r>
+        <w:rPr>
+          <w:rFonts w:ascii="Times New Roman" w:hAnsi="Times New Roman" w:cs="Times New Roman"/>
+          <w:color w:val="auto"/>
+          <w:sz w:val="24"/>
+          <w:szCs w:val="24"/>
+        </w:rPr>
+        <w:t>JavaScript – A interação</w:t>
+      </w:r>
+    </w:p>
+    <w:p>
+      <w:pPr>
+        <w:pStyle w:val="NormalWeb"/>
+        <w:spacing w:line="360" w:lineRule="auto"/>
+        <w:ind w:firstLine="567"/>
+        <w:jc w:val="both"/>
+      </w:pPr>
+      <w:r>
+        <w:t>O JavaScript acrescenta funcionalidades que tornam a plataforma mais dinâmica e agradável de utilizar.</w:t>
+      </w:r>
+    </w:p>
+    <w:p>
+      <w:pPr>
+        <w:pStyle w:val="NormalWeb"/>
+        <w:spacing w:line="360" w:lineRule="auto"/>
+        <w:ind w:firstLine="567"/>
+        <w:jc w:val="both"/>
+      </w:pPr>
+      <w:r>
+        <w:t>Graças a esta tecnologia, será possível criar menus interativos, galerias de imagens, formulários inteligentes, animações discretas e outras funcionalidades que melhoram a experiência do utilizador, tornando a navegação mais simples e intuitiva.</w:t>
+      </w:r>
+    </w:p>
+    <w:p>
+      <w:pPr>
+        <w:pStyle w:val="Ttulo2"/>
+        <w:spacing w:line="360" w:lineRule="auto"/>
+        <w:ind w:firstLine="567"/>
+        <w:jc w:val="both"/>
+        <w:rPr>
+          <w:rFonts w:ascii="Times New Roman" w:hAnsi="Times New Roman" w:cs="Times New Roman"/>
+          <w:b/>
+          <w:color w:val="auto"/>
+          <w:sz w:val="24"/>
+          <w:szCs w:val="24"/>
+        </w:rPr>
+      </w:pPr>
+      <w:r>
+        <w:rPr>
+          <w:rFonts w:ascii="Times New Roman" w:hAnsi="Times New Roman" w:cs="Times New Roman"/>
+          <w:b/>
+          <w:color w:val="auto"/>
+          <w:sz w:val="24"/>
+          <w:szCs w:val="24"/>
+        </w:rPr>
+        <w:t xml:space="preserve">9.1. </w:t>
+      </w:r>
+      <w:r>
+        <w:rPr>
+          <w:rFonts w:ascii="Times New Roman" w:hAnsi="Times New Roman" w:cs="Times New Roman"/>
+          <w:b/>
+          <w:color w:val="auto"/>
+          <w:sz w:val="24"/>
+          <w:szCs w:val="24"/>
+        </w:rPr>
+        <w:t>Organização do desenvolvimento</w:t>
+      </w:r>
+    </w:p>
+    <w:p>
+      <w:pPr>
+        <w:pStyle w:val="NormalWeb"/>
+        <w:spacing w:line="360" w:lineRule="auto"/>
+        <w:ind w:firstLine="567"/>
+        <w:jc w:val="both"/>
+      </w:pPr>
+      <w:r>
+        <w:t>Uma das preocupações do Projeto Conecta Lureframulu &amp; Precimuel é garantir que a plataforma possa ser facilmente atualizada e ampliada no futuro.</w:t>
+      </w:r>
       <w:bookmarkStart w:id="0" w:name="_GoBack"/>
       <w:bookmarkEnd w:id="0"/>
-      <w:r>
-        <w:rPr>
-          <w:rFonts w:ascii="Times New Roman" w:hAnsi="Times New Roman" w:cs="Times New Roman"/>
-          <w:i/>
-          <w:sz w:val="24"/>
-          <w:szCs w:val="24"/>
-        </w:rPr>
-        <w:t>"A tecnologia só gera valor quando é compreendida por quem toma decisões."</w:t>
-      </w:r>
-    </w:p>
-    <w:p>
-      <w:pPr>
-        <w:pStyle w:val="NormalWeb"/>
-        <w:spacing w:line="360" w:lineRule="auto"/>
-        <w:ind w:firstLine="567"/>
-        <w:jc w:val="both"/>
-      </w:pPr>
-      <w:r>
-        <w:t>O Projeto Conecta Lureframulu &amp; Precimuel será desenvolvido com recurso a tecnologias amplamente utilizadas na criação de plataformas institucionais em todo o mundo. A escolha dessas tecnologias não foi feita por serem as mais complexas, mas por reunirem características importantes para o Instituto: estabilidade, facilidade de manutenção, segurança, desempenho e possibilidade de evolução.</w:t>
-      </w:r>
-    </w:p>
-    <w:p>
-      <w:pPr>
-        <w:pStyle w:val="NormalWeb"/>
-        <w:spacing w:line="360" w:lineRule="auto"/>
-        <w:ind w:firstLine="567"/>
-        <w:jc w:val="both"/>
-      </w:pPr>
-      <w:r>
-        <w:t>A seguir, apresenta-se uma explicação simples sobre o papel de cada tecnologia na construção da plataforma.</w:t>
-      </w:r>
-    </w:p>
-    <w:p>
-      <w:pPr>
-        <w:pStyle w:val="Ttulo2"/>
-        <w:spacing w:line="360" w:lineRule="auto"/>
-        <w:ind w:firstLine="567"/>
-        <w:jc w:val="both"/>
-        <w:rPr>
-          <w:rFonts w:ascii="Times New Roman" w:hAnsi="Times New Roman" w:cs="Times New Roman"/>
-          <w:sz w:val="24"/>
-          <w:szCs w:val="24"/>
-        </w:rPr>
-      </w:pPr>
-      <w:r>
-        <w:rPr>
-          <w:rFonts w:ascii="Times New Roman" w:hAnsi="Times New Roman" w:cs="Times New Roman"/>
-          <w:sz w:val="24"/>
-          <w:szCs w:val="24"/>
-        </w:rPr>
-        <w:t>HTML – A estrutura da plataforma</w:t>
-      </w:r>
-    </w:p>
-    <w:p>
-      <w:pPr>
-        <w:pStyle w:val="NormalWeb"/>
-        <w:spacing w:line="360" w:lineRule="auto"/>
-        <w:ind w:firstLine="567"/>
-        <w:jc w:val="both"/>
-      </w:pPr>
-      <w:r>
-        <w:t>O HTML pode ser comparado à estrutura de um edifício. É a tecnologia responsável por organizar todas as informações apresentadas na plataforma, definindo onde serão exibidos os textos, imagens, menus, formulários e demais conteúdos.</w:t>
-      </w:r>
-    </w:p>
-    <w:p>
-      <w:pPr>
-        <w:pStyle w:val="NormalWeb"/>
-        <w:spacing w:line="360" w:lineRule="auto"/>
-        <w:ind w:firstLine="567"/>
-        <w:jc w:val="both"/>
-      </w:pPr>
-      <w:r>
-        <w:t>Graças ao HTML, cada informação possui um local próprio e organizado, permitindo que os visitantes encontrem facilmente aquilo que procuram.</w:t>
-      </w:r>
-    </w:p>
-    <w:p>
-      <w:pPr>
-        <w:pStyle w:val="Ttulo2"/>
-        <w:spacing w:line="360" w:lineRule="auto"/>
-        <w:ind w:firstLine="567"/>
-        <w:jc w:val="both"/>
-        <w:rPr>
-          <w:rFonts w:ascii="Times New Roman" w:hAnsi="Times New Roman" w:cs="Times New Roman"/>
-          <w:sz w:val="24"/>
-          <w:szCs w:val="24"/>
-        </w:rPr>
-      </w:pPr>
-      <w:r>
-        <w:rPr>
-          <w:rFonts w:ascii="Times New Roman" w:hAnsi="Times New Roman" w:cs="Times New Roman"/>
-          <w:sz w:val="24"/>
-          <w:szCs w:val="24"/>
-        </w:rPr>
-        <w:t>CSS – A identidade visual</w:t>
-      </w:r>
-    </w:p>
-    <w:p>
-      <w:pPr>
-        <w:pStyle w:val="NormalWeb"/>
-        <w:spacing w:line="360" w:lineRule="auto"/>
-        <w:ind w:firstLine="567"/>
-        <w:jc w:val="both"/>
-      </w:pPr>
-      <w:r>
-        <w:t>O CSS é responsável pela aparência da plataforma.</w:t>
-      </w:r>
-    </w:p>
-    <w:p>
-      <w:pPr>
-        <w:pStyle w:val="NormalWeb"/>
-        <w:spacing w:line="360" w:lineRule="auto"/>
-        <w:ind w:firstLine="567"/>
-        <w:jc w:val="both"/>
-      </w:pPr>
-      <w:r>
-        <w:t>É através desta tecnologia que são definidos os elementos visuais, como cores, tipos de letra, espaçamentos, organização das páginas e adaptação a diferentes tamanhos de ecrã, incluindo computadores, tablets e telemóveis.</w:t>
-      </w:r>
-    </w:p>
-    <w:p>
-      <w:pPr>
-        <w:pStyle w:val="NormalWeb"/>
-        <w:spacing w:line="360" w:lineRule="auto"/>
-        <w:ind w:firstLine="567"/>
-        <w:jc w:val="both"/>
-      </w:pPr>
-      <w:r>
-        <w:t>Em termos simples, enquanto o HTML constrói a estrutura, o CSS torna essa estrutura agradável, organizada e compatível com a identidade visual do Instituto.</w:t>
-      </w:r>
-    </w:p>
-    <w:p>
-      <w:pPr>
-        <w:pStyle w:val="Ttulo2"/>
-        <w:spacing w:line="360" w:lineRule="auto"/>
-        <w:ind w:firstLine="567"/>
-        <w:jc w:val="both"/>
-        <w:rPr>
-          <w:rFonts w:ascii="Times New Roman" w:hAnsi="Times New Roman" w:cs="Times New Roman"/>
-          <w:sz w:val="24"/>
-          <w:szCs w:val="24"/>
-        </w:rPr>
-      </w:pPr>
-      <w:r>
-        <w:rPr>
-          <w:rFonts w:ascii="Times New Roman" w:hAnsi="Times New Roman" w:cs="Times New Roman"/>
-          <w:sz w:val="24"/>
-          <w:szCs w:val="24"/>
-        </w:rPr>
-        <w:t>JavaScript – A interação</w:t>
-      </w:r>
-    </w:p>
-    <w:p>
-      <w:pPr>
-        <w:pStyle w:val="NormalWeb"/>
-        <w:spacing w:line="360" w:lineRule="auto"/>
-        <w:ind w:firstLine="567"/>
-        <w:jc w:val="both"/>
-      </w:pPr>
-      <w:r>
-        <w:t>O JavaScript acrescenta funcionalidades que tornam a plataforma mais dinâmica e agradável de utilizar.</w:t>
-      </w:r>
     </w:p>
     <w:p>
       <w:pPr>
@@ -4158,49 +4200,6 @@
       </w:pPr>
       <w:r>
         <w:lastRenderedPageBreak/>
-        <w:t>Graças a esta tecnologia, será possível criar menus interativos, galerias de imagens, formulários inteligentes, animações discretas e outras funcionalidades que melhoram a experiência do utilizador, tornando a navegação mais simples e intuitiva.</w:t>
-      </w:r>
-    </w:p>
-    <w:p>
-      <w:pPr>
-        <w:pStyle w:val="Ttulo2"/>
-        <w:spacing w:line="360" w:lineRule="auto"/>
-        <w:ind w:firstLine="567"/>
-        <w:jc w:val="both"/>
-        <w:rPr>
-          <w:rFonts w:ascii="Times New Roman" w:hAnsi="Times New Roman" w:cs="Times New Roman"/>
-          <w:sz w:val="24"/>
-          <w:szCs w:val="24"/>
-        </w:rPr>
-      </w:pPr>
-      <w:r>
-        <w:rPr>
-          <w:rFonts w:ascii="Times New Roman" w:hAnsi="Times New Roman" w:cs="Times New Roman"/>
-          <w:sz w:val="24"/>
-          <w:szCs w:val="24"/>
-        </w:rPr>
-        <w:t>Organização do desenvolvimento</w:t>
-      </w:r>
-    </w:p>
-    <w:p>
-      <w:pPr>
-        <w:pStyle w:val="NormalWeb"/>
-        <w:spacing w:line="360" w:lineRule="auto"/>
-        <w:ind w:firstLine="567"/>
-        <w:jc w:val="both"/>
-      </w:pPr>
-      <w:r>
-        <w:t>Uma das preocupações do Projeto Conecta Lureframulu &amp; Precimuel é garantir que a plataforma possa ser facilmente atualizada e ampliada no futuro.</w:t>
-      </w:r>
-    </w:p>
-    <w:p>
-      <w:pPr>
-        <w:pStyle w:val="NormalWeb"/>
-        <w:spacing w:line="360" w:lineRule="auto"/>
-        <w:ind w:firstLine="567"/>
-        <w:jc w:val="both"/>
-      </w:pPr>
-      <w:r>
         <w:t>Por esse motivo, o desenvolvimento será organizado de forma estruturada, separando os conteúdos, o design e as funcionalidades. Esta metodologia facilita futuras alterações, reduz o tempo necessário para manutenção e permite a implementação gradual de novos recursos sem comprometer o funcionamento da plataforma.</w:t>
       </w:r>
     </w:p>
@@ -4317,7 +4316,6 @@
         <w:jc w:val="both"/>
       </w:pPr>
       <w:r>
-        <w:lastRenderedPageBreak/>
         <w:t>oferecem elevado nível de compatibilidade com diferentes navegadores e dispositivos;</w:t>
       </w:r>
     </w:p>
@@ -4374,7 +4372,11 @@
         <w:jc w:val="both"/>
       </w:pPr>
       <w:r>
-        <w:t>Desta forma, a escolha tecnológica do Projeto Conecta Lureframulu &amp; Precimuel não procura impressionar pela complexidade, mas assegurar que o Instituto disponha de uma solução moderna, confiável e preparada para acompanhar a sua evolução ao longo do tempo.</w:t>
+        <w:t xml:space="preserve">Desta forma, a escolha tecnológica do Projeto Conecta Lureframulu &amp; Precimuel não procura impressionar pela complexidade, mas assegurar que o Instituto disponha de </w:t>
+      </w:r>
+      <w:r>
+        <w:lastRenderedPageBreak/>
+        <w:t>uma solução moderna, confiável e preparada para acompanhar a sua evolução ao longo do tempo.</w:t>
       </w:r>
     </w:p>
     <w:p>
@@ -9198,7 +9200,7 @@
 </file>
 
 <file path=customXml/itemProps1.xml><?xml version="1.0" encoding="utf-8"?>
-<ds:datastoreItem xmlns:ds="http://schemas.openxmlformats.org/officeDocument/2006/customXml" ds:itemID="{7191FAD7-BE34-467A-8949-35A0798CAFB1}">
+<ds:datastoreItem xmlns:ds="http://schemas.openxmlformats.org/officeDocument/2006/customXml" ds:itemID="{9F84AECE-02E3-4141-A10D-A81EBE37AE81}">
   <ds:schemaRefs>
     <ds:schemaRef ds:uri="http://schemas.openxmlformats.org/officeDocument/2006/bibliography"/>
   </ds:schemaRefs>

</xml_diff>

<commit_message>
Criando a página sobre nós
</commit_message>
<xml_diff>
--- a/ARQUIVOS LURE_PRECI/PROJECTO CNECTA LUREFRAMULO.docx
+++ b/ARQUIVOS LURE_PRECI/PROJECTO CNECTA LUREFRAMULO.docx
@@ -4188,8 +4188,6 @@
       <w:r>
         <w:t>Uma das preocupações do Projeto Conecta Lureframulu &amp; Precimuel é garantir que a plataforma possa ser facilmente atualizada e ampliada no futuro.</w:t>
       </w:r>
-      <w:bookmarkStart w:id="0" w:name="_GoBack"/>
-      <w:bookmarkEnd w:id="0"/>
     </w:p>
     <w:p>
       <w:pPr>
@@ -4443,10 +4441,18 @@
         <w:pStyle w:val="NormalWeb"/>
         <w:spacing w:line="360" w:lineRule="auto"/>
         <w:jc w:val="both"/>
-      </w:pPr>
-      <w:r>
+        <w:rPr>
+          <w:i/>
+        </w:rPr>
+      </w:pPr>
+      <w:r>
+        <w:rPr>
+          <w:i/>
+        </w:rPr>
         <w:t>"Antes de investir numa ideia, é importante conseguir visualizá-la. O protótipo transforma uma visão em algo concreto."</w:t>
       </w:r>
+      <w:bookmarkStart w:id="0" w:name="_GoBack"/>
+      <w:bookmarkEnd w:id="0"/>
     </w:p>
     <w:p>
       <w:pPr>
@@ -9200,7 +9206,7 @@
 </file>
 
 <file path=customXml/itemProps1.xml><?xml version="1.0" encoding="utf-8"?>
-<ds:datastoreItem xmlns:ds="http://schemas.openxmlformats.org/officeDocument/2006/customXml" ds:itemID="{9F84AECE-02E3-4141-A10D-A81EBE37AE81}">
+<ds:datastoreItem xmlns:ds="http://schemas.openxmlformats.org/officeDocument/2006/customXml" ds:itemID="{EB49EDC1-0619-4431-A379-AB9DED106450}">
   <ds:schemaRefs>
     <ds:schemaRef ds:uri="http://schemas.openxmlformats.org/officeDocument/2006/bibliography"/>
   </ds:schemaRefs>

</xml_diff>